<commit_message>
Add Run of Show, Venue Tech-Spec, and Vendor/Rental COI tools to Production section
</commit_message>
<xml_diff>
--- a/Revital_Software_Insurance_Wishlist.docx
+++ b/Revital_Software_Insurance_Wishlist.docx
@@ -1530,6 +1530,234 @@
                 <w:szCs w:val="18"/>
               </w:rPr>
               <w:t xml:space="preserve">Needed to actually run live events once that side of the business launches.</w:t>
+            </w:r>
+          </w:p>
+        </w:tc>
+      </w:tr>
+      <w:tr>
+        <w:tc>
+          <w:tcPr>
+            <w:tcW w:type="dxa" w:w="3200"/>
+            <w:shd w:fill="F6F5F3" w:val="clear"/>
+            <w:tcMar>
+              <w:top w:type="dxa" w:w="90"/>
+              <w:left w:type="dxa" w:w="110"/>
+              <w:bottom w:type="dxa" w:w="90"/>
+              <w:right w:type="dxa" w:w="110"/>
+            </w:tcMar>
+          </w:tcPr>
+          <w:p>
+            <w:r>
+              <w:rPr>
+                <w:rFonts w:ascii="Arial" w:cs="Arial" w:eastAsia="Arial" w:hAnsi="Arial"/>
+                <w:b/>
+                <w:bCs/>
+                <w:color w:val="1F2937"/>
+                <w:sz w:val="18"/>
+                <w:szCs w:val="18"/>
+              </w:rPr>
+              <w:t xml:space="preserve">Vectorworks Spotlight</w:t>
+            </w:r>
+          </w:p>
+        </w:tc>
+        <w:tc>
+          <w:tcPr>
+            <w:tcW w:type="dxa" w:w="1800"/>
+            <w:shd w:fill="F6F5F3" w:val="clear"/>
+            <w:tcMar>
+              <w:top w:type="dxa" w:w="90"/>
+              <w:left w:type="dxa" w:w="110"/>
+              <w:bottom w:type="dxa" w:w="90"/>
+              <w:right w:type="dxa" w:w="110"/>
+            </w:tcMar>
+          </w:tcPr>
+          <w:p>
+            <w:r>
+              <w:rPr>
+                <w:rFonts w:ascii="Arial" w:cs="Arial" w:eastAsia="Arial" w:hAnsi="Arial"/>
+                <w:b w:val="false"/>
+                <w:bCs w:val="false"/>
+                <w:color w:val="1F2937"/>
+                <w:sz w:val="18"/>
+                <w:szCs w:val="18"/>
+              </w:rPr>
+              <w:t xml:space="preserve">$153/mo or ~$2,530/yr</w:t>
+            </w:r>
+          </w:p>
+        </w:tc>
+        <w:tc>
+          <w:tcPr>
+            <w:tcW w:type="dxa" w:w="5200"/>
+            <w:shd w:fill="F6F5F3" w:val="clear"/>
+            <w:tcMar>
+              <w:top w:type="dxa" w:w="90"/>
+              <w:left w:type="dxa" w:w="110"/>
+              <w:bottom w:type="dxa" w:w="90"/>
+              <w:right w:type="dxa" w:w="110"/>
+            </w:tcMar>
+          </w:tcPr>
+          <w:p>
+            <w:r>
+              <w:rPr>
+                <w:rFonts w:ascii="Arial" w:cs="Arial" w:eastAsia="Arial" w:hAnsi="Arial"/>
+                <w:b w:val="false"/>
+                <w:bCs w:val="false"/>
+                <w:color w:val="1F2937"/>
+                <w:sz w:val="18"/>
+                <w:szCs w:val="18"/>
+              </w:rPr>
+              <w:t xml:space="preserve">Industry-standard AV/lighting/rigging technical drawings — precise 2D/3D floor plans, lighting plots, truss and staging diagrams. Pairs with Braceworks for structural rigging calculations. The standard tool for touring and corporate AV production.</w:t>
+            </w:r>
+          </w:p>
+        </w:tc>
+      </w:tr>
+      <w:tr>
+        <w:tc>
+          <w:tcPr>
+            <w:tcW w:type="dxa" w:w="3200"/>
+            <w:tcMar>
+              <w:top w:type="dxa" w:w="90"/>
+              <w:left w:type="dxa" w:w="110"/>
+              <w:bottom w:type="dxa" w:w="90"/>
+              <w:right w:type="dxa" w:w="110"/>
+            </w:tcMar>
+          </w:tcPr>
+          <w:p>
+            <w:r>
+              <w:rPr>
+                <w:rFonts w:ascii="Arial" w:cs="Arial" w:eastAsia="Arial" w:hAnsi="Arial"/>
+                <w:b/>
+                <w:bCs/>
+                <w:color w:val="1F2937"/>
+                <w:sz w:val="18"/>
+                <w:szCs w:val="18"/>
+              </w:rPr>
+              <w:t xml:space="preserve">Allseated (rebranded Prismm)</w:t>
+            </w:r>
+          </w:p>
+        </w:tc>
+        <w:tc>
+          <w:tcPr>
+            <w:tcW w:type="dxa" w:w="1800"/>
+            <w:tcMar>
+              <w:top w:type="dxa" w:w="90"/>
+              <w:left w:type="dxa" w:w="110"/>
+              <w:bottom w:type="dxa" w:w="90"/>
+              <w:right w:type="dxa" w:w="110"/>
+            </w:tcMar>
+          </w:tcPr>
+          <w:p>
+            <w:r>
+              <w:rPr>
+                <w:rFonts w:ascii="Arial" w:cs="Arial" w:eastAsia="Arial" w:hAnsi="Arial"/>
+                <w:b w:val="false"/>
+                <w:bCs w:val="false"/>
+                <w:color w:val="1F2937"/>
+                <w:sz w:val="18"/>
+                <w:szCs w:val="18"/>
+              </w:rPr>
+              <w:t xml:space="preserve">Custom quote — no published pricing</w:t>
+            </w:r>
+          </w:p>
+        </w:tc>
+        <w:tc>
+          <w:tcPr>
+            <w:tcW w:type="dxa" w:w="5200"/>
+            <w:tcMar>
+              <w:top w:type="dxa" w:w="90"/>
+              <w:left w:type="dxa" w:w="110"/>
+              <w:bottom w:type="dxa" w:w="90"/>
+              <w:right w:type="dxa" w:w="110"/>
+            </w:tcMar>
+          </w:tcPr>
+          <w:p>
+            <w:r>
+              <w:rPr>
+                <w:rFonts w:ascii="Arial" w:cs="Arial" w:eastAsia="Arial" w:hAnsi="Arial"/>
+                <w:b w:val="false"/>
+                <w:bCs w:val="false"/>
+                <w:color w:val="1F2937"/>
+                <w:sz w:val="18"/>
+                <w:szCs w:val="18"/>
+              </w:rPr>
+              <w:t xml:space="preserve">Client-facing 3D floor plans, seating charts, and AR/VR walkthroughs for corporate events, weddings and banquets. Real-time collaboration with clients before the event.</w:t>
+            </w:r>
+          </w:p>
+        </w:tc>
+      </w:tr>
+      <w:tr>
+        <w:tc>
+          <w:tcPr>
+            <w:tcW w:type="dxa" w:w="3200"/>
+            <w:shd w:fill="F6F5F3" w:val="clear"/>
+            <w:tcMar>
+              <w:top w:type="dxa" w:w="90"/>
+              <w:left w:type="dxa" w:w="110"/>
+              <w:bottom w:type="dxa" w:w="90"/>
+              <w:right w:type="dxa" w:w="110"/>
+            </w:tcMar>
+          </w:tcPr>
+          <w:p>
+            <w:r>
+              <w:rPr>
+                <w:rFonts w:ascii="Arial" w:cs="Arial" w:eastAsia="Arial" w:hAnsi="Arial"/>
+                <w:b/>
+                <w:bCs/>
+                <w:color w:val="1F2937"/>
+                <w:sz w:val="18"/>
+                <w:szCs w:val="18"/>
+              </w:rPr>
+              <w:t xml:space="preserve">SketchUp</w:t>
+            </w:r>
+          </w:p>
+        </w:tc>
+        <w:tc>
+          <w:tcPr>
+            <w:tcW w:type="dxa" w:w="1800"/>
+            <w:shd w:fill="F6F5F3" w:val="clear"/>
+            <w:tcMar>
+              <w:top w:type="dxa" w:w="90"/>
+              <w:left w:type="dxa" w:w="110"/>
+              <w:bottom w:type="dxa" w:w="90"/>
+              <w:right w:type="dxa" w:w="110"/>
+            </w:tcMar>
+          </w:tcPr>
+          <w:p>
+            <w:r>
+              <w:rPr>
+                <w:rFonts w:ascii="Arial" w:cs="Arial" w:eastAsia="Arial" w:hAnsi="Arial"/>
+                <w:b w:val="false"/>
+                <w:bCs w:val="false"/>
+                <w:color w:val="1F2937"/>
+                <w:sz w:val="18"/>
+                <w:szCs w:val="18"/>
+              </w:rPr>
+              <w:t xml:space="preserve">Free – $820/yr by tier</w:t>
+            </w:r>
+          </w:p>
+        </w:tc>
+        <w:tc>
+          <w:tcPr>
+            <w:tcW w:type="dxa" w:w="5200"/>
+            <w:shd w:fill="F6F5F3" w:val="clear"/>
+            <w:tcMar>
+              <w:top w:type="dxa" w:w="90"/>
+              <w:left w:type="dxa" w:w="110"/>
+              <w:bottom w:type="dxa" w:w="90"/>
+              <w:right w:type="dxa" w:w="110"/>
+            </w:tcMar>
+          </w:tcPr>
+          <w:p>
+            <w:r>
+              <w:rPr>
+                <w:rFonts w:ascii="Arial" w:cs="Arial" w:eastAsia="Arial" w:hAnsi="Arial"/>
+                <w:b w:val="false"/>
+                <w:bCs w:val="false"/>
+                <w:color w:val="1F2937"/>
+                <w:sz w:val="18"/>
+                <w:szCs w:val="18"/>
+              </w:rPr>
+              <w:t xml:space="preserve">Fast, low-cost 2D/3D room and staging mockups. Good entry point to start learning the floor-plan workflow now, before investing in Vectorworks once live-event bookings are real.</w:t>
             </w:r>
           </w:p>
         </w:tc>

</xml_diff>

<commit_message>
Restyle Copywriting Assistant to match Hub design system; split Execution nav into Content Creation and Account Ops
</commit_message>
<xml_diff>
--- a/Revital_Software_Insurance_Wishlist.docx
+++ b/Revital_Software_Insurance_Wishlist.docx
@@ -1008,6 +1008,406 @@
           </w:p>
         </w:tc>
       </w:tr>
+      <w:tr>
+        <w:tc>
+          <w:tcPr>
+            <w:tcW w:type="dxa" w:w="2400"/>
+            <w:tcMar>
+              <w:top w:type="dxa" w:w="90"/>
+              <w:left w:type="dxa" w:w="110"/>
+              <w:bottom w:type="dxa" w:w="90"/>
+              <w:right w:type="dxa" w:w="110"/>
+            </w:tcMar>
+          </w:tcPr>
+          <w:p>
+            <w:r>
+              <w:rPr>
+                <w:rFonts w:ascii="Arial" w:cs="Arial" w:eastAsia="Arial" w:hAnsi="Arial"/>
+                <w:b/>
+                <w:bCs/>
+                <w:color w:val="1F2937"/>
+                <w:sz w:val="18"/>
+                <w:szCs w:val="18"/>
+              </w:rPr>
+              <w:t xml:space="preserve">Framer</w:t>
+            </w:r>
+          </w:p>
+        </w:tc>
+        <w:tc>
+          <w:tcPr>
+            <w:tcW w:type="dxa" w:w="1400"/>
+            <w:tcMar>
+              <w:top w:type="dxa" w:w="90"/>
+              <w:left w:type="dxa" w:w="110"/>
+              <w:bottom w:type="dxa" w:w="90"/>
+              <w:right w:type="dxa" w:w="110"/>
+            </w:tcMar>
+          </w:tcPr>
+          <w:p>
+            <w:r>
+              <w:rPr>
+                <w:rFonts w:ascii="Arial" w:cs="Arial" w:eastAsia="Arial" w:hAnsi="Arial"/>
+                <w:b w:val="false"/>
+                <w:bCs w:val="false"/>
+                <w:color w:val="1F2937"/>
+                <w:sz w:val="18"/>
+                <w:szCs w:val="18"/>
+              </w:rPr>
+              <w:t xml:space="preserve">From ~$15–35/mo per site</w:t>
+            </w:r>
+          </w:p>
+        </w:tc>
+        <w:tc>
+          <w:tcPr>
+            <w:tcW w:type="dxa" w:w="1300"/>
+            <w:tcMar>
+              <w:top w:type="dxa" w:w="90"/>
+              <w:left w:type="dxa" w:w="110"/>
+              <w:bottom w:type="dxa" w:w="90"/>
+              <w:right w:type="dxa" w:w="110"/>
+            </w:tcMar>
+          </w:tcPr>
+          <w:p>
+            <w:r>
+              <w:rPr>
+                <w:rFonts w:ascii="Arial" w:cs="Arial" w:eastAsia="Arial" w:hAnsi="Arial"/>
+                <w:b w:val="false"/>
+                <w:bCs w:val="false"/>
+                <w:color w:val="1F2937"/>
+                <w:sz w:val="18"/>
+                <w:szCs w:val="18"/>
+              </w:rPr>
+              <w:t xml:space="preserve">Web Dev</w:t>
+            </w:r>
+          </w:p>
+        </w:tc>
+        <w:tc>
+          <w:tcPr>
+            <w:tcW w:type="dxa" w:w="5100"/>
+            <w:tcMar>
+              <w:top w:type="dxa" w:w="90"/>
+              <w:left w:type="dxa" w:w="110"/>
+              <w:bottom w:type="dxa" w:w="90"/>
+              <w:right w:type="dxa" w:w="110"/>
+            </w:tcMar>
+          </w:tcPr>
+          <w:p>
+            <w:r>
+              <w:rPr>
+                <w:rFonts w:ascii="Arial" w:cs="Arial" w:eastAsia="Arial" w:hAnsi="Arial"/>
+                <w:b w:val="false"/>
+                <w:bCs w:val="false"/>
+                <w:color w:val="1F2937"/>
+                <w:sz w:val="18"/>
+                <w:szCs w:val="18"/>
+              </w:rPr>
+              <w:t xml:space="preserve">For client sites where design speed/animation matters most — portfolios, campaign pages, service-based sites without heavy content or e-commerce.</w:t>
+            </w:r>
+          </w:p>
+        </w:tc>
+      </w:tr>
+      <w:tr>
+        <w:tc>
+          <w:tcPr>
+            <w:tcW w:type="dxa" w:w="2400"/>
+            <w:shd w:fill="F6F5F3" w:val="clear"/>
+            <w:tcMar>
+              <w:top w:type="dxa" w:w="90"/>
+              <w:left w:type="dxa" w:w="110"/>
+              <w:bottom w:type="dxa" w:w="90"/>
+              <w:right w:type="dxa" w:w="110"/>
+            </w:tcMar>
+          </w:tcPr>
+          <w:p>
+            <w:r>
+              <w:rPr>
+                <w:rFonts w:ascii="Arial" w:cs="Arial" w:eastAsia="Arial" w:hAnsi="Arial"/>
+                <w:b/>
+                <w:bCs/>
+                <w:color w:val="1F2937"/>
+                <w:sz w:val="18"/>
+                <w:szCs w:val="18"/>
+              </w:rPr>
+              <w:t xml:space="preserve">Webflow</w:t>
+            </w:r>
+          </w:p>
+        </w:tc>
+        <w:tc>
+          <w:tcPr>
+            <w:tcW w:type="dxa" w:w="1400"/>
+            <w:shd w:fill="F6F5F3" w:val="clear"/>
+            <w:tcMar>
+              <w:top w:type="dxa" w:w="90"/>
+              <w:left w:type="dxa" w:w="110"/>
+              <w:bottom w:type="dxa" w:w="90"/>
+              <w:right w:type="dxa" w:w="110"/>
+            </w:tcMar>
+          </w:tcPr>
+          <w:p>
+            <w:r>
+              <w:rPr>
+                <w:rFonts w:ascii="Arial" w:cs="Arial" w:eastAsia="Arial" w:hAnsi="Arial"/>
+                <w:b w:val="false"/>
+                <w:bCs w:val="false"/>
+                <w:color w:val="1F2937"/>
+                <w:sz w:val="18"/>
+                <w:szCs w:val="18"/>
+              </w:rPr>
+              <w:t xml:space="preserve">$19–39/mo per site</w:t>
+            </w:r>
+          </w:p>
+        </w:tc>
+        <w:tc>
+          <w:tcPr>
+            <w:tcW w:type="dxa" w:w="1300"/>
+            <w:shd w:fill="F6F5F3" w:val="clear"/>
+            <w:tcMar>
+              <w:top w:type="dxa" w:w="90"/>
+              <w:left w:type="dxa" w:w="110"/>
+              <w:bottom w:type="dxa" w:w="90"/>
+              <w:right w:type="dxa" w:w="110"/>
+            </w:tcMar>
+          </w:tcPr>
+          <w:p>
+            <w:r>
+              <w:rPr>
+                <w:rFonts w:ascii="Arial" w:cs="Arial" w:eastAsia="Arial" w:hAnsi="Arial"/>
+                <w:b w:val="false"/>
+                <w:bCs w:val="false"/>
+                <w:color w:val="1F2937"/>
+                <w:sz w:val="18"/>
+                <w:szCs w:val="18"/>
+              </w:rPr>
+              <w:t xml:space="preserve">Web Dev</w:t>
+            </w:r>
+          </w:p>
+        </w:tc>
+        <w:tc>
+          <w:tcPr>
+            <w:tcW w:type="dxa" w:w="5100"/>
+            <w:shd w:fill="F6F5F3" w:val="clear"/>
+            <w:tcMar>
+              <w:top w:type="dxa" w:w="90"/>
+              <w:left w:type="dxa" w:w="110"/>
+              <w:bottom w:type="dxa" w:w="90"/>
+              <w:right w:type="dxa" w:w="110"/>
+            </w:tcMar>
+          </w:tcPr>
+          <w:p>
+            <w:r>
+              <w:rPr>
+                <w:rFonts w:ascii="Arial" w:cs="Arial" w:eastAsia="Arial" w:hAnsi="Arial"/>
+                <w:b w:val="false"/>
+                <w:bCs w:val="false"/>
+                <w:color w:val="1F2937"/>
+                <w:sz w:val="18"/>
+                <w:szCs w:val="18"/>
+              </w:rPr>
+              <w:t xml:space="preserve">For client sites needing deeper CMS control, technical SEO, or small-scale native e-commerce that Framer can't handle well.</w:t>
+            </w:r>
+          </w:p>
+        </w:tc>
+      </w:tr>
+      <w:tr>
+        <w:tc>
+          <w:tcPr>
+            <w:tcW w:type="dxa" w:w="2400"/>
+            <w:tcMar>
+              <w:top w:type="dxa" w:w="90"/>
+              <w:left w:type="dxa" w:w="110"/>
+              <w:bottom w:type="dxa" w:w="90"/>
+              <w:right w:type="dxa" w:w="110"/>
+            </w:tcMar>
+          </w:tcPr>
+          <w:p>
+            <w:r>
+              <w:rPr>
+                <w:rFonts w:ascii="Arial" w:cs="Arial" w:eastAsia="Arial" w:hAnsi="Arial"/>
+                <w:b/>
+                <w:bCs/>
+                <w:color w:val="1F2937"/>
+                <w:sz w:val="18"/>
+                <w:szCs w:val="18"/>
+              </w:rPr>
+              <w:t xml:space="preserve">Shopify Plus</w:t>
+            </w:r>
+          </w:p>
+        </w:tc>
+        <w:tc>
+          <w:tcPr>
+            <w:tcW w:type="dxa" w:w="1400"/>
+            <w:tcMar>
+              <w:top w:type="dxa" w:w="90"/>
+              <w:left w:type="dxa" w:w="110"/>
+              <w:bottom w:type="dxa" w:w="90"/>
+              <w:right w:type="dxa" w:w="110"/>
+            </w:tcMar>
+          </w:tcPr>
+          <w:p>
+            <w:r>
+              <w:rPr>
+                <w:rFonts w:ascii="Arial" w:cs="Arial" w:eastAsia="Arial" w:hAnsi="Arial"/>
+                <w:b w:val="false"/>
+                <w:bCs w:val="false"/>
+                <w:color w:val="1F2937"/>
+                <w:sz w:val="18"/>
+                <w:szCs w:val="18"/>
+              </w:rPr>
+              <w:t xml:space="preserve">~$2,300/mo+</w:t>
+            </w:r>
+          </w:p>
+        </w:tc>
+        <w:tc>
+          <w:tcPr>
+            <w:tcW w:type="dxa" w:w="1300"/>
+            <w:tcMar>
+              <w:top w:type="dxa" w:w="90"/>
+              <w:left w:type="dxa" w:w="110"/>
+              <w:bottom w:type="dxa" w:w="90"/>
+              <w:right w:type="dxa" w:w="110"/>
+            </w:tcMar>
+          </w:tcPr>
+          <w:p>
+            <w:r>
+              <w:rPr>
+                <w:rFonts w:ascii="Arial" w:cs="Arial" w:eastAsia="Arial" w:hAnsi="Arial"/>
+                <w:b w:val="false"/>
+                <w:bCs w:val="false"/>
+                <w:color w:val="1F2937"/>
+                <w:sz w:val="18"/>
+                <w:szCs w:val="18"/>
+              </w:rPr>
+              <w:t xml:space="preserve">Web Dev / E-commerce</w:t>
+            </w:r>
+          </w:p>
+        </w:tc>
+        <w:tc>
+          <w:tcPr>
+            <w:tcW w:type="dxa" w:w="5100"/>
+            <w:tcMar>
+              <w:top w:type="dxa" w:w="90"/>
+              <w:left w:type="dxa" w:w="110"/>
+              <w:bottom w:type="dxa" w:w="90"/>
+              <w:right w:type="dxa" w:w="110"/>
+            </w:tcMar>
+          </w:tcPr>
+          <w:p>
+            <w:r>
+              <w:rPr>
+                <w:rFonts w:ascii="Arial" w:cs="Arial" w:eastAsia="Arial" w:hAnsi="Arial"/>
+                <w:b w:val="false"/>
+                <w:bCs w:val="false"/>
+                <w:color w:val="1F2937"/>
+                <w:sz w:val="18"/>
+                <w:szCs w:val="18"/>
+              </w:rPr>
+              <w:t xml:space="preserve">For a client whose store outgrows small-scale — fastest to launch, biggest app ecosystem, best for high-volume selling without heavy customization. Base fee plus a small % of sales past $800K/mo.</w:t>
+            </w:r>
+          </w:p>
+        </w:tc>
+      </w:tr>
+      <w:tr>
+        <w:tc>
+          <w:tcPr>
+            <w:tcW w:type="dxa" w:w="2400"/>
+            <w:shd w:fill="F6F5F3" w:val="clear"/>
+            <w:tcMar>
+              <w:top w:type="dxa" w:w="90"/>
+              <w:left w:type="dxa" w:w="110"/>
+              <w:bottom w:type="dxa" w:w="90"/>
+              <w:right w:type="dxa" w:w="110"/>
+            </w:tcMar>
+          </w:tcPr>
+          <w:p>
+            <w:r>
+              <w:rPr>
+                <w:rFonts w:ascii="Arial" w:cs="Arial" w:eastAsia="Arial" w:hAnsi="Arial"/>
+                <w:b/>
+                <w:bCs/>
+                <w:color w:val="1F2937"/>
+                <w:sz w:val="18"/>
+                <w:szCs w:val="18"/>
+              </w:rPr>
+              <w:t xml:space="preserve">BigCommerce Enterprise</w:t>
+            </w:r>
+          </w:p>
+        </w:tc>
+        <w:tc>
+          <w:tcPr>
+            <w:tcW w:type="dxa" w:w="1400"/>
+            <w:shd w:fill="F6F5F3" w:val="clear"/>
+            <w:tcMar>
+              <w:top w:type="dxa" w:w="90"/>
+              <w:left w:type="dxa" w:w="110"/>
+              <w:bottom w:type="dxa" w:w="90"/>
+              <w:right w:type="dxa" w:w="110"/>
+            </w:tcMar>
+          </w:tcPr>
+          <w:p>
+            <w:r>
+              <w:rPr>
+                <w:rFonts w:ascii="Arial" w:cs="Arial" w:eastAsia="Arial" w:hAnsi="Arial"/>
+                <w:b w:val="false"/>
+                <w:bCs w:val="false"/>
+                <w:color w:val="1F2937"/>
+                <w:sz w:val="18"/>
+                <w:szCs w:val="18"/>
+              </w:rPr>
+              <w:t xml:space="preserve">$1,000–15,000+/mo</w:t>
+            </w:r>
+          </w:p>
+        </w:tc>
+        <w:tc>
+          <w:tcPr>
+            <w:tcW w:type="dxa" w:w="1300"/>
+            <w:shd w:fill="F6F5F3" w:val="clear"/>
+            <w:tcMar>
+              <w:top w:type="dxa" w:w="90"/>
+              <w:left w:type="dxa" w:w="110"/>
+              <w:bottom w:type="dxa" w:w="90"/>
+              <w:right w:type="dxa" w:w="110"/>
+            </w:tcMar>
+          </w:tcPr>
+          <w:p>
+            <w:r>
+              <w:rPr>
+                <w:rFonts w:ascii="Arial" w:cs="Arial" w:eastAsia="Arial" w:hAnsi="Arial"/>
+                <w:b w:val="false"/>
+                <w:bCs w:val="false"/>
+                <w:color w:val="1F2937"/>
+                <w:sz w:val="18"/>
+                <w:szCs w:val="18"/>
+              </w:rPr>
+              <w:t xml:space="preserve">Web Dev / E-commerce</w:t>
+            </w:r>
+          </w:p>
+        </w:tc>
+        <w:tc>
+          <w:tcPr>
+            <w:tcW w:type="dxa" w:w="5100"/>
+            <w:shd w:fill="F6F5F3" w:val="clear"/>
+            <w:tcMar>
+              <w:top w:type="dxa" w:w="90"/>
+              <w:left w:type="dxa" w:w="110"/>
+              <w:bottom w:type="dxa" w:w="90"/>
+              <w:right w:type="dxa" w:w="110"/>
+            </w:tcMar>
+          </w:tcPr>
+          <w:p>
+            <w:r>
+              <w:rPr>
+                <w:rFonts w:ascii="Arial" w:cs="Arial" w:eastAsia="Arial" w:hAnsi="Arial"/>
+                <w:b w:val="false"/>
+                <w:bCs w:val="false"/>
+                <w:color w:val="1F2937"/>
+                <w:sz w:val="18"/>
+                <w:szCs w:val="18"/>
+              </w:rPr>
+              <w:t xml:space="preserve">Alternative to Shopify Plus for a client with a large/complex catalog, B2B pricing rules, or multi-storefront needs — more native features, fewer paid apps required. Custom-quoted by volume.</w:t>
+            </w:r>
+          </w:p>
+        </w:tc>
+      </w:tr>
     </w:tbl>
     <w:p>
       <w:pPr>
@@ -1179,7 +1579,7 @@
                 <w:sz w:val="18"/>
                 <w:szCs w:val="18"/>
               </w:rPr>
-              <w:t xml:space="preserve">DaVinci Resolve Studio</w:t>
+              <w:t xml:space="preserve">DaVinci Resolve Studio (additional seats)</w:t>
             </w:r>
           </w:p>
         </w:tc>
@@ -1203,7 +1603,7 @@
                 <w:sz w:val="18"/>
                 <w:szCs w:val="18"/>
               </w:rPr>
-              <w:t xml:space="preserve">$295 one-time</w:t>
+              <w:t xml:space="preserve">$295 one-time/seat</w:t>
             </w:r>
           </w:p>
         </w:tc>
@@ -1227,7 +1627,7 @@
                 <w:sz w:val="18"/>
                 <w:szCs w:val="18"/>
               </w:rPr>
-              <w:t xml:space="preserve">Video editing — one-time license, no subscription, ready whenever AV/production work resumes.</w:t>
+              <w:t xml:space="preserve">You already have a license — this is for when additional editors/team members need their own copy. One-time cost per seat, no subscription.</w:t>
             </w:r>
           </w:p>
         </w:tc>
@@ -1758,6 +2158,1214 @@
                 <w:szCs w:val="18"/>
               </w:rPr>
               <w:t xml:space="preserve">Fast, low-cost 2D/3D room and staging mockups. Good entry point to start learning the floor-plan workflow now, before investing in Vectorworks once live-event bookings are real.</w:t>
+            </w:r>
+          </w:p>
+        </w:tc>
+      </w:tr>
+      <w:tr>
+        <w:tc>
+          <w:tcPr>
+            <w:tcW w:type="dxa" w:w="3200"/>
+            <w:tcMar>
+              <w:top w:type="dxa" w:w="90"/>
+              <w:left w:type="dxa" w:w="110"/>
+              <w:bottom w:type="dxa" w:w="90"/>
+              <w:right w:type="dxa" w:w="110"/>
+            </w:tcMar>
+          </w:tcPr>
+          <w:p>
+            <w:r>
+              <w:rPr>
+                <w:rFonts w:ascii="Arial" w:cs="Arial" w:eastAsia="Arial" w:hAnsi="Arial"/>
+                <w:b/>
+                <w:bCs/>
+                <w:color w:val="1F2937"/>
+                <w:sz w:val="18"/>
+                <w:szCs w:val="18"/>
+              </w:rPr>
+              <w:t xml:space="preserve">QLab</w:t>
+            </w:r>
+          </w:p>
+        </w:tc>
+        <w:tc>
+          <w:tcPr>
+            <w:tcW w:type="dxa" w:w="1800"/>
+            <w:tcMar>
+              <w:top w:type="dxa" w:w="90"/>
+              <w:left w:type="dxa" w:w="110"/>
+              <w:bottom w:type="dxa" w:w="90"/>
+              <w:right w:type="dxa" w:w="110"/>
+            </w:tcMar>
+          </w:tcPr>
+          <w:p>
+            <w:r>
+              <w:rPr>
+                <w:rFonts w:ascii="Arial" w:cs="Arial" w:eastAsia="Arial" w:hAnsi="Arial"/>
+                <w:b w:val="false"/>
+                <w:bCs w:val="false"/>
+                <w:color w:val="1F2937"/>
+                <w:sz w:val="18"/>
+                <w:szCs w:val="18"/>
+              </w:rPr>
+              <w:t xml:space="preserve">Free (basic) – $299–$999 one-time (Audio/Video/Lighting licenses)</w:t>
+            </w:r>
+          </w:p>
+        </w:tc>
+        <w:tc>
+          <w:tcPr>
+            <w:tcW w:type="dxa" w:w="5200"/>
+            <w:tcMar>
+              <w:top w:type="dxa" w:w="90"/>
+              <w:left w:type="dxa" w:w="110"/>
+              <w:bottom w:type="dxa" w:w="90"/>
+              <w:right w:type="dxa" w:w="110"/>
+            </w:tcMar>
+          </w:tcPr>
+          <w:p>
+            <w:r>
+              <w:rPr>
+                <w:rFonts w:ascii="Arial" w:cs="Arial" w:eastAsia="Arial" w:hAnsi="Arial"/>
+                <w:b w:val="false"/>
+                <w:bCs w:val="false"/>
+                <w:color w:val="1F2937"/>
+                <w:sz w:val="18"/>
+                <w:szCs w:val="18"/>
+              </w:rPr>
+              <w:t xml:space="preserve">Cue-based show control for macOS — sequences audio, video and lighting cues into one timeline triggered live during a show. Standard for corporate AV and theatrical show calling.</w:t>
+            </w:r>
+          </w:p>
+        </w:tc>
+      </w:tr>
+      <w:tr>
+        <w:tc>
+          <w:tcPr>
+            <w:tcW w:type="dxa" w:w="3200"/>
+            <w:shd w:fill="F6F5F3" w:val="clear"/>
+            <w:tcMar>
+              <w:top w:type="dxa" w:w="90"/>
+              <w:left w:type="dxa" w:w="110"/>
+              <w:bottom w:type="dxa" w:w="90"/>
+              <w:right w:type="dxa" w:w="110"/>
+            </w:tcMar>
+          </w:tcPr>
+          <w:p>
+            <w:r>
+              <w:rPr>
+                <w:rFonts w:ascii="Arial" w:cs="Arial" w:eastAsia="Arial" w:hAnsi="Arial"/>
+                <w:b/>
+                <w:bCs/>
+                <w:color w:val="1F2937"/>
+                <w:sz w:val="18"/>
+                <w:szCs w:val="18"/>
+              </w:rPr>
+              <w:t xml:space="preserve">Shure Wireless Workbench (WWB)</w:t>
+            </w:r>
+          </w:p>
+        </w:tc>
+        <w:tc>
+          <w:tcPr>
+            <w:tcW w:type="dxa" w:w="1800"/>
+            <w:shd w:fill="F6F5F3" w:val="clear"/>
+            <w:tcMar>
+              <w:top w:type="dxa" w:w="90"/>
+              <w:left w:type="dxa" w:w="110"/>
+              <w:bottom w:type="dxa" w:w="90"/>
+              <w:right w:type="dxa" w:w="110"/>
+            </w:tcMar>
+          </w:tcPr>
+          <w:p>
+            <w:r>
+              <w:rPr>
+                <w:rFonts w:ascii="Arial" w:cs="Arial" w:eastAsia="Arial" w:hAnsi="Arial"/>
+                <w:b w:val="false"/>
+                <w:bCs w:val="false"/>
+                <w:color w:val="1F2937"/>
+                <w:sz w:val="18"/>
+                <w:szCs w:val="18"/>
+              </w:rPr>
+              <w:t xml:space="preserve">Free</w:t>
+            </w:r>
+          </w:p>
+        </w:tc>
+        <w:tc>
+          <w:tcPr>
+            <w:tcW w:type="dxa" w:w="5200"/>
+            <w:shd w:fill="F6F5F3" w:val="clear"/>
+            <w:tcMar>
+              <w:top w:type="dxa" w:w="90"/>
+              <w:left w:type="dxa" w:w="110"/>
+              <w:bottom w:type="dxa" w:w="90"/>
+              <w:right w:type="dxa" w:w="110"/>
+            </w:tcMar>
+          </w:tcPr>
+          <w:p>
+            <w:r>
+              <w:rPr>
+                <w:rFonts w:ascii="Arial" w:cs="Arial" w:eastAsia="Arial" w:hAnsi="Arial"/>
+                <w:b w:val="false"/>
+                <w:bCs w:val="false"/>
+                <w:color w:val="1F2937"/>
+                <w:sz w:val="18"/>
+                <w:szCs w:val="18"/>
+              </w:rPr>
+              <w:t xml:space="preserve">RF frequency coordination — plans wireless mic/IEM frequencies ahead of a show to avoid interference. Essential once multiple wireless mics are running in the same room as other RF traffic.</w:t>
+            </w:r>
+          </w:p>
+        </w:tc>
+      </w:tr>
+      <w:tr>
+        <w:tc>
+          <w:tcPr>
+            <w:tcW w:type="dxa" w:w="3200"/>
+            <w:tcMar>
+              <w:top w:type="dxa" w:w="90"/>
+              <w:left w:type="dxa" w:w="110"/>
+              <w:bottom w:type="dxa" w:w="90"/>
+              <w:right w:type="dxa" w:w="110"/>
+            </w:tcMar>
+          </w:tcPr>
+          <w:p>
+            <w:r>
+              <w:rPr>
+                <w:rFonts w:ascii="Arial" w:cs="Arial" w:eastAsia="Arial" w:hAnsi="Arial"/>
+                <w:b/>
+                <w:bCs/>
+                <w:color w:val="1F2937"/>
+                <w:sz w:val="18"/>
+                <w:szCs w:val="18"/>
+              </w:rPr>
+              <w:t xml:space="preserve">L-Acoustics Soundvision / d&amp;b ArrayCalc</w:t>
+            </w:r>
+          </w:p>
+        </w:tc>
+        <w:tc>
+          <w:tcPr>
+            <w:tcW w:type="dxa" w:w="1800"/>
+            <w:tcMar>
+              <w:top w:type="dxa" w:w="90"/>
+              <w:left w:type="dxa" w:w="110"/>
+              <w:bottom w:type="dxa" w:w="90"/>
+              <w:right w:type="dxa" w:w="110"/>
+            </w:tcMar>
+          </w:tcPr>
+          <w:p>
+            <w:r>
+              <w:rPr>
+                <w:rFonts w:ascii="Arial" w:cs="Arial" w:eastAsia="Arial" w:hAnsi="Arial"/>
+                <w:b w:val="false"/>
+                <w:bCs w:val="false"/>
+                <w:color w:val="1F2937"/>
+                <w:sz w:val="18"/>
+                <w:szCs w:val="18"/>
+              </w:rPr>
+              <w:t xml:space="preserve">Free (manufacturer-specific)</w:t>
+            </w:r>
+          </w:p>
+        </w:tc>
+        <w:tc>
+          <w:tcPr>
+            <w:tcW w:type="dxa" w:w="5200"/>
+            <w:tcMar>
+              <w:top w:type="dxa" w:w="90"/>
+              <w:left w:type="dxa" w:w="110"/>
+              <w:bottom w:type="dxa" w:w="90"/>
+              <w:right w:type="dxa" w:w="110"/>
+            </w:tcMar>
+          </w:tcPr>
+          <w:p>
+            <w:r>
+              <w:rPr>
+                <w:rFonts w:ascii="Arial" w:cs="Arial" w:eastAsia="Arial" w:hAnsi="Arial"/>
+                <w:b w:val="false"/>
+                <w:bCs w:val="false"/>
+                <w:color w:val="1F2937"/>
+                <w:sz w:val="18"/>
+                <w:szCs w:val="18"/>
+              </w:rPr>
+              <w:t xml:space="preserve">Speaker system prediction software — models a venue's dimensions and simulates PA coverage/SPL before load-in, so hang points and box counts are planned, not guessed. Which one to use depends on the PA brand being rented.</w:t>
+            </w:r>
+          </w:p>
+        </w:tc>
+      </w:tr>
+      <w:tr>
+        <w:tc>
+          <w:tcPr>
+            <w:tcW w:type="dxa" w:w="3200"/>
+            <w:shd w:fill="F6F5F3" w:val="clear"/>
+            <w:tcMar>
+              <w:top w:type="dxa" w:w="90"/>
+              <w:left w:type="dxa" w:w="110"/>
+              <w:bottom w:type="dxa" w:w="90"/>
+              <w:right w:type="dxa" w:w="110"/>
+            </w:tcMar>
+          </w:tcPr>
+          <w:p>
+            <w:r>
+              <w:rPr>
+                <w:rFonts w:ascii="Arial" w:cs="Arial" w:eastAsia="Arial" w:hAnsi="Arial"/>
+                <w:b/>
+                <w:bCs/>
+                <w:color w:val="1F2937"/>
+                <w:sz w:val="18"/>
+                <w:szCs w:val="18"/>
+              </w:rPr>
+              <w:t xml:space="preserve">vMix</w:t>
+            </w:r>
+          </w:p>
+        </w:tc>
+        <w:tc>
+          <w:tcPr>
+            <w:tcW w:type="dxa" w:w="1800"/>
+            <w:shd w:fill="F6F5F3" w:val="clear"/>
+            <w:tcMar>
+              <w:top w:type="dxa" w:w="90"/>
+              <w:left w:type="dxa" w:w="110"/>
+              <w:bottom w:type="dxa" w:w="90"/>
+              <w:right w:type="dxa" w:w="110"/>
+            </w:tcMar>
+          </w:tcPr>
+          <w:p>
+            <w:r>
+              <w:rPr>
+                <w:rFonts w:ascii="Arial" w:cs="Arial" w:eastAsia="Arial" w:hAnsi="Arial"/>
+                <w:b w:val="false"/>
+                <w:bCs w:val="false"/>
+                <w:color w:val="1F2937"/>
+                <w:sz w:val="18"/>
+                <w:szCs w:val="18"/>
+              </w:rPr>
+              <w:t xml:space="preserve">Free (Basic HD, 720p) – from $60 one-time (perpetual license, no subscription)</w:t>
+            </w:r>
+          </w:p>
+        </w:tc>
+        <w:tc>
+          <w:tcPr>
+            <w:tcW w:type="dxa" w:w="5200"/>
+            <w:shd w:fill="F6F5F3" w:val="clear"/>
+            <w:tcMar>
+              <w:top w:type="dxa" w:w="90"/>
+              <w:left w:type="dxa" w:w="110"/>
+              <w:bottom w:type="dxa" w:w="90"/>
+              <w:right w:type="dxa" w:w="110"/>
+            </w:tcMar>
+          </w:tcPr>
+          <w:p>
+            <w:r>
+              <w:rPr>
+                <w:rFonts w:ascii="Arial" w:cs="Arial" w:eastAsia="Arial" w:hAnsi="Arial"/>
+                <w:b w:val="false"/>
+                <w:bCs w:val="false"/>
+                <w:color w:val="1F2937"/>
+                <w:sz w:val="18"/>
+                <w:szCs w:val="18"/>
+              </w:rPr>
+              <w:t xml:space="preserve">Live multi-camera video switching, graphics overlays, recording and streaming for hybrid/livestreamed events. One-time license, no recurring cost.</w:t>
+            </w:r>
+          </w:p>
+        </w:tc>
+      </w:tr>
+      <w:tr>
+        <w:tc>
+          <w:tcPr>
+            <w:tcW w:type="dxa" w:w="3200"/>
+            <w:tcMar>
+              <w:top w:type="dxa" w:w="90"/>
+              <w:left w:type="dxa" w:w="110"/>
+              <w:bottom w:type="dxa" w:w="90"/>
+              <w:right w:type="dxa" w:w="110"/>
+            </w:tcMar>
+          </w:tcPr>
+          <w:p>
+            <w:r>
+              <w:rPr>
+                <w:rFonts w:ascii="Arial" w:cs="Arial" w:eastAsia="Arial" w:hAnsi="Arial"/>
+                <w:b/>
+                <w:bCs/>
+                <w:color w:val="1F2937"/>
+                <w:sz w:val="18"/>
+                <w:szCs w:val="18"/>
+              </w:rPr>
+              <w:t xml:space="preserve">Capture</w:t>
+            </w:r>
+          </w:p>
+        </w:tc>
+        <w:tc>
+          <w:tcPr>
+            <w:tcW w:type="dxa" w:w="1800"/>
+            <w:tcMar>
+              <w:top w:type="dxa" w:w="90"/>
+              <w:left w:type="dxa" w:w="110"/>
+              <w:bottom w:type="dxa" w:w="90"/>
+              <w:right w:type="dxa" w:w="110"/>
+            </w:tcMar>
+          </w:tcPr>
+          <w:p>
+            <w:r>
+              <w:rPr>
+                <w:rFonts w:ascii="Arial" w:cs="Arial" w:eastAsia="Arial" w:hAnsi="Arial"/>
+                <w:b w:val="false"/>
+                <w:bCs w:val="false"/>
+                <w:color w:val="1F2937"/>
+                <w:sz w:val="18"/>
+                <w:szCs w:val="18"/>
+              </w:rPr>
+              <w:t xml:space="preserve">Licensed per fixture count (custom pricing)</w:t>
+            </w:r>
+          </w:p>
+        </w:tc>
+        <w:tc>
+          <w:tcPr>
+            <w:tcW w:type="dxa" w:w="5200"/>
+            <w:tcMar>
+              <w:top w:type="dxa" w:w="90"/>
+              <w:left w:type="dxa" w:w="110"/>
+              <w:bottom w:type="dxa" w:w="90"/>
+              <w:right w:type="dxa" w:w="110"/>
+            </w:tcMar>
+          </w:tcPr>
+          <w:p>
+            <w:r>
+              <w:rPr>
+                <w:rFonts w:ascii="Arial" w:cs="Arial" w:eastAsia="Arial" w:hAnsi="Arial"/>
+                <w:b w:val="false"/>
+                <w:bCs w:val="false"/>
+                <w:color w:val="1F2937"/>
+                <w:sz w:val="18"/>
+                <w:szCs w:val="18"/>
+              </w:rPr>
+              <w:t xml:space="preserve">Offline lighting visualizer and console programmer — pre-program and preview lighting cues on a laptop before load-in instead of programming live on-site. Pairs with Vectorworks Spotlight's lighting plots.</w:t>
+            </w:r>
+          </w:p>
+        </w:tc>
+      </w:tr>
+      <w:tr>
+        <w:tc>
+          <w:tcPr>
+            <w:tcW w:type="dxa" w:w="3200"/>
+            <w:shd w:fill="F6F5F3" w:val="clear"/>
+            <w:tcMar>
+              <w:top w:type="dxa" w:w="90"/>
+              <w:left w:type="dxa" w:w="110"/>
+              <w:bottom w:type="dxa" w:w="90"/>
+              <w:right w:type="dxa" w:w="110"/>
+            </w:tcMar>
+          </w:tcPr>
+          <w:p>
+            <w:r>
+              <w:rPr>
+                <w:rFonts w:ascii="Arial" w:cs="Arial" w:eastAsia="Arial" w:hAnsi="Arial"/>
+                <w:b/>
+                <w:bCs/>
+                <w:color w:val="1F2937"/>
+                <w:sz w:val="18"/>
+                <w:szCs w:val="18"/>
+              </w:rPr>
+              <w:t xml:space="preserve">Frame.io</w:t>
+            </w:r>
+          </w:p>
+        </w:tc>
+        <w:tc>
+          <w:tcPr>
+            <w:tcW w:type="dxa" w:w="1800"/>
+            <w:shd w:fill="F6F5F3" w:val="clear"/>
+            <w:tcMar>
+              <w:top w:type="dxa" w:w="90"/>
+              <w:left w:type="dxa" w:w="110"/>
+              <w:bottom w:type="dxa" w:w="90"/>
+              <w:right w:type="dxa" w:w="110"/>
+            </w:tcMar>
+          </w:tcPr>
+          <w:p>
+            <w:r>
+              <w:rPr>
+                <w:rFonts w:ascii="Arial" w:cs="Arial" w:eastAsia="Arial" w:hAnsi="Arial"/>
+                <w:b w:val="false"/>
+                <w:bCs w:val="false"/>
+                <w:color w:val="1F2937"/>
+                <w:sz w:val="18"/>
+                <w:szCs w:val="18"/>
+              </w:rPr>
+              <w:t xml:space="preserve">$15–50/user/mo + storage</w:t>
+            </w:r>
+          </w:p>
+        </w:tc>
+        <w:tc>
+          <w:tcPr>
+            <w:tcW w:type="dxa" w:w="5200"/>
+            <w:shd w:fill="F6F5F3" w:val="clear"/>
+            <w:tcMar>
+              <w:top w:type="dxa" w:w="90"/>
+              <w:left w:type="dxa" w:w="110"/>
+              <w:bottom w:type="dxa" w:w="90"/>
+              <w:right w:type="dxa" w:w="110"/>
+            </w:tcMar>
+          </w:tcPr>
+          <w:p>
+            <w:r>
+              <w:rPr>
+                <w:rFonts w:ascii="Arial" w:cs="Arial" w:eastAsia="Arial" w:hAnsi="Arial"/>
+                <w:b w:val="false"/>
+                <w:bCs w:val="false"/>
+                <w:color w:val="1F2937"/>
+                <w:sz w:val="18"/>
+                <w:szCs w:val="18"/>
+              </w:rPr>
+              <w:t xml:space="preserve">Client review &amp; approval on video cuts — timecoded comments directly on the footage and version history, so clients mark up edits precisely instead of over email.</w:t>
+            </w:r>
+          </w:p>
+        </w:tc>
+      </w:tr>
+      <w:tr>
+        <w:tc>
+          <w:tcPr>
+            <w:tcW w:type="dxa" w:w="3200"/>
+            <w:tcMar>
+              <w:top w:type="dxa" w:w="90"/>
+              <w:left w:type="dxa" w:w="110"/>
+              <w:bottom w:type="dxa" w:w="90"/>
+              <w:right w:type="dxa" w:w="110"/>
+            </w:tcMar>
+          </w:tcPr>
+          <w:p>
+            <w:r>
+              <w:rPr>
+                <w:rFonts w:ascii="Arial" w:cs="Arial" w:eastAsia="Arial" w:hAnsi="Arial"/>
+                <w:b/>
+                <w:bCs/>
+                <w:color w:val="1F2937"/>
+                <w:sz w:val="18"/>
+                <w:szCs w:val="18"/>
+              </w:rPr>
+              <w:t xml:space="preserve">LucidLink</w:t>
+            </w:r>
+          </w:p>
+        </w:tc>
+        <w:tc>
+          <w:tcPr>
+            <w:tcW w:type="dxa" w:w="1800"/>
+            <w:tcMar>
+              <w:top w:type="dxa" w:w="90"/>
+              <w:left w:type="dxa" w:w="110"/>
+              <w:bottom w:type="dxa" w:w="90"/>
+              <w:right w:type="dxa" w:w="110"/>
+            </w:tcMar>
+          </w:tcPr>
+          <w:p>
+            <w:r>
+              <w:rPr>
+                <w:rFonts w:ascii="Arial" w:cs="Arial" w:eastAsia="Arial" w:hAnsi="Arial"/>
+                <w:b w:val="false"/>
+                <w:bCs w:val="false"/>
+                <w:color w:val="1F2937"/>
+                <w:sz w:val="18"/>
+                <w:szCs w:val="18"/>
+              </w:rPr>
+              <w:t xml:space="preserve">$7–32/member/mo by tier</w:t>
+            </w:r>
+          </w:p>
+        </w:tc>
+        <w:tc>
+          <w:tcPr>
+            <w:tcW w:type="dxa" w:w="5200"/>
+            <w:tcMar>
+              <w:top w:type="dxa" w:w="90"/>
+              <w:left w:type="dxa" w:w="110"/>
+              <w:bottom w:type="dxa" w:w="90"/>
+              <w:right w:type="dxa" w:w="110"/>
+            </w:tcMar>
+          </w:tcPr>
+          <w:p>
+            <w:r>
+              <w:rPr>
+                <w:rFonts w:ascii="Arial" w:cs="Arial" w:eastAsia="Arial" w:hAnsi="Arial"/>
+                <w:b w:val="false"/>
+                <w:bCs w:val="false"/>
+                <w:color w:val="1F2937"/>
+                <w:sz w:val="18"/>
+                <w:szCs w:val="18"/>
+              </w:rPr>
+              <w:t xml:space="preserve">Mounts shared cloud footage as a local drive so editors work directly in Premiere/Resolve off shared raw footage — no more waiting on downloads or juggling physical drives once more than one person touches a project.</w:t>
+            </w:r>
+          </w:p>
+        </w:tc>
+      </w:tr>
+      <w:tr>
+        <w:tc>
+          <w:tcPr>
+            <w:tcW w:type="dxa" w:w="3200"/>
+            <w:shd w:fill="F6F5F3" w:val="clear"/>
+            <w:tcMar>
+              <w:top w:type="dxa" w:w="90"/>
+              <w:left w:type="dxa" w:w="110"/>
+              <w:bottom w:type="dxa" w:w="90"/>
+              <w:right w:type="dxa" w:w="110"/>
+            </w:tcMar>
+          </w:tcPr>
+          <w:p>
+            <w:r>
+              <w:rPr>
+                <w:rFonts w:ascii="Arial" w:cs="Arial" w:eastAsia="Arial" w:hAnsi="Arial"/>
+                <w:b/>
+                <w:bCs/>
+                <w:color w:val="1F2937"/>
+                <w:sz w:val="18"/>
+                <w:szCs w:val="18"/>
+              </w:rPr>
+              <w:t xml:space="preserve">Epidemic Sound</w:t>
+            </w:r>
+          </w:p>
+        </w:tc>
+        <w:tc>
+          <w:tcPr>
+            <w:tcW w:type="dxa" w:w="1800"/>
+            <w:shd w:fill="F6F5F3" w:val="clear"/>
+            <w:tcMar>
+              <w:top w:type="dxa" w:w="90"/>
+              <w:left w:type="dxa" w:w="110"/>
+              <w:bottom w:type="dxa" w:w="90"/>
+              <w:right w:type="dxa" w:w="110"/>
+            </w:tcMar>
+          </w:tcPr>
+          <w:p>
+            <w:r>
+              <w:rPr>
+                <w:rFonts w:ascii="Arial" w:cs="Arial" w:eastAsia="Arial" w:hAnsi="Arial"/>
+                <w:b w:val="false"/>
+                <w:bCs w:val="false"/>
+                <w:color w:val="1F2937"/>
+                <w:sz w:val="18"/>
+                <w:szCs w:val="18"/>
+              </w:rPr>
+              <w:t xml:space="preserve">From ~$6–10/mo</w:t>
+            </w:r>
+          </w:p>
+        </w:tc>
+        <w:tc>
+          <w:tcPr>
+            <w:tcW w:type="dxa" w:w="5200"/>
+            <w:shd w:fill="F6F5F3" w:val="clear"/>
+            <w:tcMar>
+              <w:top w:type="dxa" w:w="90"/>
+              <w:left w:type="dxa" w:w="110"/>
+              <w:bottom w:type="dxa" w:w="90"/>
+              <w:right w:type="dxa" w:w="110"/>
+            </w:tcMar>
+          </w:tcPr>
+          <w:p>
+            <w:r>
+              <w:rPr>
+                <w:rFonts w:ascii="Arial" w:cs="Arial" w:eastAsia="Arial" w:hAnsi="Arial"/>
+                <w:b w:val="false"/>
+                <w:bCs w:val="false"/>
+                <w:color w:val="1F2937"/>
+                <w:sz w:val="18"/>
+                <w:szCs w:val="18"/>
+              </w:rPr>
+              <w:t xml:space="preserve">Royalty-free music and SFX licensing for client video deliverables — avoids copyright strikes/takedowns on published content. Larger catalog than most competitors, stems included with every track.</w:t>
+            </w:r>
+          </w:p>
+        </w:tc>
+      </w:tr>
+      <w:tr>
+        <w:tc>
+          <w:tcPr>
+            <w:tcW w:type="dxa" w:w="3200"/>
+            <w:tcMar>
+              <w:top w:type="dxa" w:w="90"/>
+              <w:left w:type="dxa" w:w="110"/>
+              <w:bottom w:type="dxa" w:w="90"/>
+              <w:right w:type="dxa" w:w="110"/>
+            </w:tcMar>
+          </w:tcPr>
+          <w:p>
+            <w:r>
+              <w:rPr>
+                <w:rFonts w:ascii="Arial" w:cs="Arial" w:eastAsia="Arial" w:hAnsi="Arial"/>
+                <w:b/>
+                <w:bCs/>
+                <w:color w:val="1F2937"/>
+                <w:sz w:val="18"/>
+                <w:szCs w:val="18"/>
+              </w:rPr>
+              <w:t xml:space="preserve">Final Draft</w:t>
+            </w:r>
+          </w:p>
+        </w:tc>
+        <w:tc>
+          <w:tcPr>
+            <w:tcW w:type="dxa" w:w="1800"/>
+            <w:tcMar>
+              <w:top w:type="dxa" w:w="90"/>
+              <w:left w:type="dxa" w:w="110"/>
+              <w:bottom w:type="dxa" w:w="90"/>
+              <w:right w:type="dxa" w:w="110"/>
+            </w:tcMar>
+          </w:tcPr>
+          <w:p>
+            <w:r>
+              <w:rPr>
+                <w:rFonts w:ascii="Arial" w:cs="Arial" w:eastAsia="Arial" w:hAnsi="Arial"/>
+                <w:b w:val="false"/>
+                <w:bCs w:val="false"/>
+                <w:color w:val="1F2937"/>
+                <w:sz w:val="18"/>
+                <w:szCs w:val="18"/>
+              </w:rPr>
+              <w:t xml:space="preserve">$249 one-time</w:t>
+            </w:r>
+          </w:p>
+        </w:tc>
+        <w:tc>
+          <w:tcPr>
+            <w:tcW w:type="dxa" w:w="5200"/>
+            <w:tcMar>
+              <w:top w:type="dxa" w:w="90"/>
+              <w:left w:type="dxa" w:w="110"/>
+              <w:bottom w:type="dxa" w:w="90"/>
+              <w:right w:type="dxa" w:w="110"/>
+            </w:tcMar>
+          </w:tcPr>
+          <w:p>
+            <w:r>
+              <w:rPr>
+                <w:rFonts w:ascii="Arial" w:cs="Arial" w:eastAsia="Arial" w:hAnsi="Arial"/>
+                <w:b w:val="false"/>
+                <w:bCs w:val="false"/>
+                <w:color w:val="1F2937"/>
+                <w:sz w:val="18"/>
+                <w:szCs w:val="18"/>
+              </w:rPr>
+              <w:t xml:space="preserve">Industry-standard screenwriting software for script development — proper screenplay formatting, revision tracking, collaboration.</w:t>
+            </w:r>
+          </w:p>
+        </w:tc>
+      </w:tr>
+      <w:tr>
+        <w:tc>
+          <w:tcPr>
+            <w:tcW w:type="dxa" w:w="3200"/>
+            <w:shd w:fill="F6F5F3" w:val="clear"/>
+            <w:tcMar>
+              <w:top w:type="dxa" w:w="90"/>
+              <w:left w:type="dxa" w:w="110"/>
+              <w:bottom w:type="dxa" w:w="90"/>
+              <w:right w:type="dxa" w:w="110"/>
+            </w:tcMar>
+          </w:tcPr>
+          <w:p>
+            <w:r>
+              <w:rPr>
+                <w:rFonts w:ascii="Arial" w:cs="Arial" w:eastAsia="Arial" w:hAnsi="Arial"/>
+                <w:b/>
+                <w:bCs/>
+                <w:color w:val="1F2937"/>
+                <w:sz w:val="18"/>
+                <w:szCs w:val="18"/>
+              </w:rPr>
+              <w:t xml:space="preserve">Logic Pro</w:t>
+            </w:r>
+          </w:p>
+        </w:tc>
+        <w:tc>
+          <w:tcPr>
+            <w:tcW w:type="dxa" w:w="1800"/>
+            <w:shd w:fill="F6F5F3" w:val="clear"/>
+            <w:tcMar>
+              <w:top w:type="dxa" w:w="90"/>
+              <w:left w:type="dxa" w:w="110"/>
+              <w:bottom w:type="dxa" w:w="90"/>
+              <w:right w:type="dxa" w:w="110"/>
+            </w:tcMar>
+          </w:tcPr>
+          <w:p>
+            <w:r>
+              <w:rPr>
+                <w:rFonts w:ascii="Arial" w:cs="Arial" w:eastAsia="Arial" w:hAnsi="Arial"/>
+                <w:b w:val="false"/>
+                <w:bCs w:val="false"/>
+                <w:color w:val="1F2937"/>
+                <w:sz w:val="18"/>
+                <w:szCs w:val="18"/>
+              </w:rPr>
+              <w:t xml:space="preserve">$199 one-time (Mac only)</w:t>
+            </w:r>
+          </w:p>
+        </w:tc>
+        <w:tc>
+          <w:tcPr>
+            <w:tcW w:type="dxa" w:w="5200"/>
+            <w:shd w:fill="F6F5F3" w:val="clear"/>
+            <w:tcMar>
+              <w:top w:type="dxa" w:w="90"/>
+              <w:left w:type="dxa" w:w="110"/>
+              <w:bottom w:type="dxa" w:w="90"/>
+              <w:right w:type="dxa" w:w="110"/>
+            </w:tcMar>
+          </w:tcPr>
+          <w:p>
+            <w:r>
+              <w:rPr>
+                <w:rFonts w:ascii="Arial" w:cs="Arial" w:eastAsia="Arial" w:hAnsi="Arial"/>
+                <w:b w:val="false"/>
+                <w:bCs w:val="false"/>
+                <w:color w:val="1F2937"/>
+                <w:sz w:val="18"/>
+                <w:szCs w:val="18"/>
+              </w:rPr>
+              <w:t xml:space="preserve">Full DAW for music producing, mixing and band recordings — a fraction of Pro Tools' cost for the same core workflow. Pro Tools is the alternative if cross-studio/Windows compatibility is needed, but it's subscription-based and pricier.</w:t>
+            </w:r>
+          </w:p>
+        </w:tc>
+      </w:tr>
+      <w:tr>
+        <w:tc>
+          <w:tcPr>
+            <w:tcW w:type="dxa" w:w="3200"/>
+            <w:tcMar>
+              <w:top w:type="dxa" w:w="90"/>
+              <w:left w:type="dxa" w:w="110"/>
+              <w:bottom w:type="dxa" w:w="90"/>
+              <w:right w:type="dxa" w:w="110"/>
+            </w:tcMar>
+          </w:tcPr>
+          <w:p>
+            <w:r>
+              <w:rPr>
+                <w:rFonts w:ascii="Arial" w:cs="Arial" w:eastAsia="Arial" w:hAnsi="Arial"/>
+                <w:b/>
+                <w:bCs/>
+                <w:color w:val="1F2937"/>
+                <w:sz w:val="18"/>
+                <w:szCs w:val="18"/>
+              </w:rPr>
+              <w:t xml:space="preserve">iZotope Ozone</w:t>
+            </w:r>
+          </w:p>
+        </w:tc>
+        <w:tc>
+          <w:tcPr>
+            <w:tcW w:type="dxa" w:w="1800"/>
+            <w:tcMar>
+              <w:top w:type="dxa" w:w="90"/>
+              <w:left w:type="dxa" w:w="110"/>
+              <w:bottom w:type="dxa" w:w="90"/>
+              <w:right w:type="dxa" w:w="110"/>
+            </w:tcMar>
+          </w:tcPr>
+          <w:p>
+            <w:r>
+              <w:rPr>
+                <w:rFonts w:ascii="Arial" w:cs="Arial" w:eastAsia="Arial" w:hAnsi="Arial"/>
+                <w:b w:val="false"/>
+                <w:bCs w:val="false"/>
+                <w:color w:val="1F2937"/>
+                <w:sz w:val="18"/>
+                <w:szCs w:val="18"/>
+              </w:rPr>
+              <w:t xml:space="preserve">$55–499 by tier</w:t>
+            </w:r>
+          </w:p>
+        </w:tc>
+        <w:tc>
+          <w:tcPr>
+            <w:tcW w:type="dxa" w:w="5200"/>
+            <w:tcMar>
+              <w:top w:type="dxa" w:w="90"/>
+              <w:left w:type="dxa" w:w="110"/>
+              <w:bottom w:type="dxa" w:w="90"/>
+              <w:right w:type="dxa" w:w="110"/>
+            </w:tcMar>
+          </w:tcPr>
+          <w:p>
+            <w:r>
+              <w:rPr>
+                <w:rFonts w:ascii="Arial" w:cs="Arial" w:eastAsia="Arial" w:hAnsi="Arial"/>
+                <w:b w:val="false"/>
+                <w:bCs w:val="false"/>
+                <w:color w:val="1F2937"/>
+                <w:sz w:val="18"/>
+                <w:szCs w:val="18"/>
+              </w:rPr>
+              <w:t xml:space="preserve">Mastering suite — takes a finished mix to a release-ready final master.</w:t>
+            </w:r>
+          </w:p>
+        </w:tc>
+      </w:tr>
+      <w:tr>
+        <w:tc>
+          <w:tcPr>
+            <w:tcW w:type="dxa" w:w="3200"/>
+            <w:shd w:fill="F6F5F3" w:val="clear"/>
+            <w:tcMar>
+              <w:top w:type="dxa" w:w="90"/>
+              <w:left w:type="dxa" w:w="110"/>
+              <w:bottom w:type="dxa" w:w="90"/>
+              <w:right w:type="dxa" w:w="110"/>
+            </w:tcMar>
+          </w:tcPr>
+          <w:p>
+            <w:r>
+              <w:rPr>
+                <w:rFonts w:ascii="Arial" w:cs="Arial" w:eastAsia="Arial" w:hAnsi="Arial"/>
+                <w:b/>
+                <w:bCs/>
+                <w:color w:val="1F2937"/>
+                <w:sz w:val="18"/>
+                <w:szCs w:val="18"/>
+              </w:rPr>
+              <w:t xml:space="preserve">iZotope RX</w:t>
+            </w:r>
+          </w:p>
+        </w:tc>
+        <w:tc>
+          <w:tcPr>
+            <w:tcW w:type="dxa" w:w="1800"/>
+            <w:shd w:fill="F6F5F3" w:val="clear"/>
+            <w:tcMar>
+              <w:top w:type="dxa" w:w="90"/>
+              <w:left w:type="dxa" w:w="110"/>
+              <w:bottom w:type="dxa" w:w="90"/>
+              <w:right w:type="dxa" w:w="110"/>
+            </w:tcMar>
+          </w:tcPr>
+          <w:p>
+            <w:r>
+              <w:rPr>
+                <w:rFonts w:ascii="Arial" w:cs="Arial" w:eastAsia="Arial" w:hAnsi="Arial"/>
+                <w:b w:val="false"/>
+                <w:bCs w:val="false"/>
+                <w:color w:val="1F2937"/>
+                <w:sz w:val="18"/>
+                <w:szCs w:val="18"/>
+              </w:rPr>
+              <w:t xml:space="preserve">$99–1,399 by tier</w:t>
+            </w:r>
+          </w:p>
+        </w:tc>
+        <w:tc>
+          <w:tcPr>
+            <w:tcW w:type="dxa" w:w="5200"/>
+            <w:shd w:fill="F6F5F3" w:val="clear"/>
+            <w:tcMar>
+              <w:top w:type="dxa" w:w="90"/>
+              <w:left w:type="dxa" w:w="110"/>
+              <w:bottom w:type="dxa" w:w="90"/>
+              <w:right w:type="dxa" w:w="110"/>
+            </w:tcMar>
+          </w:tcPr>
+          <w:p>
+            <w:r>
+              <w:rPr>
+                <w:rFonts w:ascii="Arial" w:cs="Arial" w:eastAsia="Arial" w:hAnsi="Arial"/>
+                <w:b w:val="false"/>
+                <w:bCs w:val="false"/>
+                <w:color w:val="1F2937"/>
+                <w:sz w:val="18"/>
+                <w:szCs w:val="18"/>
+              </w:rPr>
+              <w:t xml:space="preserve">Audio repair and cleanup — removes hum, clicks and background noise from band/location recordings.</w:t>
+            </w:r>
+          </w:p>
+        </w:tc>
+      </w:tr>
+      <w:tr>
+        <w:tc>
+          <w:tcPr>
+            <w:tcW w:type="dxa" w:w="3200"/>
+            <w:tcMar>
+              <w:top w:type="dxa" w:w="90"/>
+              <w:left w:type="dxa" w:w="110"/>
+              <w:bottom w:type="dxa" w:w="90"/>
+              <w:right w:type="dxa" w:w="110"/>
+            </w:tcMar>
+          </w:tcPr>
+          <w:p>
+            <w:r>
+              <w:rPr>
+                <w:rFonts w:ascii="Arial" w:cs="Arial" w:eastAsia="Arial" w:hAnsi="Arial"/>
+                <w:b/>
+                <w:bCs/>
+                <w:color w:val="1F2937"/>
+                <w:sz w:val="18"/>
+                <w:szCs w:val="18"/>
+              </w:rPr>
+              <w:t xml:space="preserve">Splice</w:t>
+            </w:r>
+          </w:p>
+        </w:tc>
+        <w:tc>
+          <w:tcPr>
+            <w:tcW w:type="dxa" w:w="1800"/>
+            <w:tcMar>
+              <w:top w:type="dxa" w:w="90"/>
+              <w:left w:type="dxa" w:w="110"/>
+              <w:bottom w:type="dxa" w:w="90"/>
+              <w:right w:type="dxa" w:w="110"/>
+            </w:tcMar>
+          </w:tcPr>
+          <w:p>
+            <w:r>
+              <w:rPr>
+                <w:rFonts w:ascii="Arial" w:cs="Arial" w:eastAsia="Arial" w:hAnsi="Arial"/>
+                <w:b w:val="false"/>
+                <w:bCs w:val="false"/>
+                <w:color w:val="1F2937"/>
+                <w:sz w:val="18"/>
+                <w:szCs w:val="18"/>
+              </w:rPr>
+              <w:t xml:space="preserve">~$10–12/mo</w:t>
+            </w:r>
+          </w:p>
+        </w:tc>
+        <w:tc>
+          <w:tcPr>
+            <w:tcW w:type="dxa" w:w="5200"/>
+            <w:tcMar>
+              <w:top w:type="dxa" w:w="90"/>
+              <w:left w:type="dxa" w:w="110"/>
+              <w:bottom w:type="dxa" w:w="90"/>
+              <w:right w:type="dxa" w:w="110"/>
+            </w:tcMar>
+          </w:tcPr>
+          <w:p>
+            <w:r>
+              <w:rPr>
+                <w:rFonts w:ascii="Arial" w:cs="Arial" w:eastAsia="Arial" w:hAnsi="Arial"/>
+                <w:b w:val="false"/>
+                <w:bCs w:val="false"/>
+                <w:color w:val="1F2937"/>
+                <w:sz w:val="18"/>
+                <w:szCs w:val="18"/>
+              </w:rPr>
+              <w:t xml:space="preserve">Sample and loop library subscription for sound design work.</w:t>
+            </w:r>
+          </w:p>
+        </w:tc>
+      </w:tr>
+      <w:tr>
+        <w:tc>
+          <w:tcPr>
+            <w:tcW w:type="dxa" w:w="3200"/>
+            <w:shd w:fill="F6F5F3" w:val="clear"/>
+            <w:tcMar>
+              <w:top w:type="dxa" w:w="90"/>
+              <w:left w:type="dxa" w:w="110"/>
+              <w:bottom w:type="dxa" w:w="90"/>
+              <w:right w:type="dxa" w:w="110"/>
+            </w:tcMar>
+          </w:tcPr>
+          <w:p>
+            <w:r>
+              <w:rPr>
+                <w:rFonts w:ascii="Arial" w:cs="Arial" w:eastAsia="Arial" w:hAnsi="Arial"/>
+                <w:b/>
+                <w:bCs/>
+                <w:color w:val="1F2937"/>
+                <w:sz w:val="18"/>
+                <w:szCs w:val="18"/>
+              </w:rPr>
+              <w:t xml:space="preserve">grandMA3 onPC</w:t>
+            </w:r>
+          </w:p>
+        </w:tc>
+        <w:tc>
+          <w:tcPr>
+            <w:tcW w:type="dxa" w:w="1800"/>
+            <w:shd w:fill="F6F5F3" w:val="clear"/>
+            <w:tcMar>
+              <w:top w:type="dxa" w:w="90"/>
+              <w:left w:type="dxa" w:w="110"/>
+              <w:bottom w:type="dxa" w:w="90"/>
+              <w:right w:type="dxa" w:w="110"/>
+            </w:tcMar>
+          </w:tcPr>
+          <w:p>
+            <w:r>
+              <w:rPr>
+                <w:rFonts w:ascii="Arial" w:cs="Arial" w:eastAsia="Arial" w:hAnsi="Arial"/>
+                <w:b w:val="false"/>
+                <w:bCs w:val="false"/>
+                <w:color w:val="1F2937"/>
+                <w:sz w:val="18"/>
+                <w:szCs w:val="18"/>
+              </w:rPr>
+              <w:t xml:space="preserve">Free (software only; hardware control surfaces cost extra)</w:t>
+            </w:r>
+          </w:p>
+        </w:tc>
+        <w:tc>
+          <w:tcPr>
+            <w:tcW w:type="dxa" w:w="5200"/>
+            <w:shd w:fill="F6F5F3" w:val="clear"/>
+            <w:tcMar>
+              <w:top w:type="dxa" w:w="90"/>
+              <w:left w:type="dxa" w:w="110"/>
+              <w:bottom w:type="dxa" w:w="90"/>
+              <w:right w:type="dxa" w:w="110"/>
+            </w:tcMar>
+          </w:tcPr>
+          <w:p>
+            <w:r>
+              <w:rPr>
+                <w:rFonts w:ascii="Arial" w:cs="Arial" w:eastAsia="Arial" w:hAnsi="Arial"/>
+                <w:b w:val="false"/>
+                <w:bCs w:val="false"/>
+                <w:color w:val="1F2937"/>
+                <w:sz w:val="18"/>
+                <w:szCs w:val="18"/>
+              </w:rPr>
+              <w:t xml:space="preserve">Industry-standard lighting console software for live production — full-featured for free until a physical control surface is added.</w:t>
+            </w:r>
+          </w:p>
+        </w:tc>
+      </w:tr>
+      <w:tr>
+        <w:tc>
+          <w:tcPr>
+            <w:tcW w:type="dxa" w:w="3200"/>
+            <w:tcMar>
+              <w:top w:type="dxa" w:w="90"/>
+              <w:left w:type="dxa" w:w="110"/>
+              <w:bottom w:type="dxa" w:w="90"/>
+              <w:right w:type="dxa" w:w="110"/>
+            </w:tcMar>
+          </w:tcPr>
+          <w:p>
+            <w:r>
+              <w:rPr>
+                <w:rFonts w:ascii="Arial" w:cs="Arial" w:eastAsia="Arial" w:hAnsi="Arial"/>
+                <w:b/>
+                <w:bCs/>
+                <w:color w:val="1F2937"/>
+                <w:sz w:val="18"/>
+                <w:szCs w:val="18"/>
+              </w:rPr>
+              <w:t xml:space="preserve">OBS Studio</w:t>
+            </w:r>
+          </w:p>
+        </w:tc>
+        <w:tc>
+          <w:tcPr>
+            <w:tcW w:type="dxa" w:w="1800"/>
+            <w:tcMar>
+              <w:top w:type="dxa" w:w="90"/>
+              <w:left w:type="dxa" w:w="110"/>
+              <w:bottom w:type="dxa" w:w="90"/>
+              <w:right w:type="dxa" w:w="110"/>
+            </w:tcMar>
+          </w:tcPr>
+          <w:p>
+            <w:r>
+              <w:rPr>
+                <w:rFonts w:ascii="Arial" w:cs="Arial" w:eastAsia="Arial" w:hAnsi="Arial"/>
+                <w:b w:val="false"/>
+                <w:bCs w:val="false"/>
+                <w:color w:val="1F2937"/>
+                <w:sz w:val="18"/>
+                <w:szCs w:val="18"/>
+              </w:rPr>
+              <w:t xml:space="preserve">Free</w:t>
+            </w:r>
+          </w:p>
+        </w:tc>
+        <w:tc>
+          <w:tcPr>
+            <w:tcW w:type="dxa" w:w="5200"/>
+            <w:tcMar>
+              <w:top w:type="dxa" w:w="90"/>
+              <w:left w:type="dxa" w:w="110"/>
+              <w:bottom w:type="dxa" w:w="90"/>
+              <w:right w:type="dxa" w:w="110"/>
+            </w:tcMar>
+          </w:tcPr>
+          <w:p>
+            <w:r>
+              <w:rPr>
+                <w:rFonts w:ascii="Arial" w:cs="Arial" w:eastAsia="Arial" w:hAnsi="Arial"/>
+                <w:b w:val="false"/>
+                <w:bCs w:val="false"/>
+                <w:color w:val="1F2937"/>
+                <w:sz w:val="18"/>
+                <w:szCs w:val="18"/>
+              </w:rPr>
+              <w:t xml:space="preserve">Free live streaming/switching software — a no-cost fallback or complement to vMix for live streaming.</w:t>
+            </w:r>
+          </w:p>
+        </w:tc>
+      </w:tr>
+      <w:tr>
+        <w:tc>
+          <w:tcPr>
+            <w:tcW w:type="dxa" w:w="3200"/>
+            <w:shd w:fill="F6F5F3" w:val="clear"/>
+            <w:tcMar>
+              <w:top w:type="dxa" w:w="90"/>
+              <w:left w:type="dxa" w:w="110"/>
+              <w:bottom w:type="dxa" w:w="90"/>
+              <w:right w:type="dxa" w:w="110"/>
+            </w:tcMar>
+          </w:tcPr>
+          <w:p>
+            <w:r>
+              <w:rPr>
+                <w:rFonts w:ascii="Arial" w:cs="Arial" w:eastAsia="Arial" w:hAnsi="Arial"/>
+                <w:b/>
+                <w:bCs/>
+                <w:color w:val="1F2937"/>
+                <w:sz w:val="18"/>
+                <w:szCs w:val="18"/>
+              </w:rPr>
+              <w:t xml:space="preserve">Blackmagic ATEM switcher</w:t>
+            </w:r>
+          </w:p>
+        </w:tc>
+        <w:tc>
+          <w:tcPr>
+            <w:tcW w:type="dxa" w:w="1800"/>
+            <w:shd w:fill="F6F5F3" w:val="clear"/>
+            <w:tcMar>
+              <w:top w:type="dxa" w:w="90"/>
+              <w:left w:type="dxa" w:w="110"/>
+              <w:bottom w:type="dxa" w:w="90"/>
+              <w:right w:type="dxa" w:w="110"/>
+            </w:tcMar>
+          </w:tcPr>
+          <w:p>
+            <w:r>
+              <w:rPr>
+                <w:rFonts w:ascii="Arial" w:cs="Arial" w:eastAsia="Arial" w:hAnsi="Arial"/>
+                <w:b w:val="false"/>
+                <w:bCs w:val="false"/>
+                <w:color w:val="1F2937"/>
+                <w:sz w:val="18"/>
+                <w:szCs w:val="18"/>
+              </w:rPr>
+              <w:t xml:space="preserve">$1,095–1,865 (Mini Extreme/Constellation HD) up to $7,995+ (Constellation IP)</w:t>
+            </w:r>
+          </w:p>
+        </w:tc>
+        <w:tc>
+          <w:tcPr>
+            <w:tcW w:type="dxa" w:w="5200"/>
+            <w:shd w:fill="F6F5F3" w:val="clear"/>
+            <w:tcMar>
+              <w:top w:type="dxa" w:w="90"/>
+              <w:left w:type="dxa" w:w="110"/>
+              <w:bottom w:type="dxa" w:w="90"/>
+              <w:right w:type="dxa" w:w="110"/>
+            </w:tcMar>
+          </w:tcPr>
+          <w:p>
+            <w:r>
+              <w:rPr>
+                <w:rFonts w:ascii="Arial" w:cs="Arial" w:eastAsia="Arial" w:hAnsi="Arial"/>
+                <w:b w:val="false"/>
+                <w:bCs w:val="false"/>
+                <w:color w:val="1F2937"/>
+                <w:sz w:val="18"/>
+                <w:szCs w:val="18"/>
+              </w:rPr>
+              <w:t xml:space="preserve">Dedicated hardware video switcher — the actual broadcast-industry standard above the software tier vMix operates at. Worth it once live production volume justifies a physical switcher over a laptop-based workflow.</w:t>
             </w:r>
           </w:p>
         </w:tc>
@@ -2137,6 +3745,83 @@
           </w:p>
         </w:tc>
       </w:tr>
+      <w:tr>
+        <w:tc>
+          <w:tcPr>
+            <w:tcW w:type="dxa" w:w="3200"/>
+            <w:shd w:fill="F6F5F3" w:val="clear"/>
+            <w:tcMar>
+              <w:top w:type="dxa" w:w="90"/>
+              <w:left w:type="dxa" w:w="110"/>
+              <w:bottom w:type="dxa" w:w="90"/>
+              <w:right w:type="dxa" w:w="110"/>
+            </w:tcMar>
+          </w:tcPr>
+          <w:p>
+            <w:r>
+              <w:rPr>
+                <w:rFonts w:ascii="Arial" w:cs="Arial" w:eastAsia="Arial" w:hAnsi="Arial"/>
+                <w:b/>
+                <w:bCs/>
+                <w:color w:val="1F2937"/>
+                <w:sz w:val="18"/>
+                <w:szCs w:val="18"/>
+              </w:rPr>
+              <w:t xml:space="preserve">Cyber Liability Insurance</w:t>
+            </w:r>
+          </w:p>
+        </w:tc>
+        <w:tc>
+          <w:tcPr>
+            <w:tcW w:type="dxa" w:w="1800"/>
+            <w:shd w:fill="F6F5F3" w:val="clear"/>
+            <w:tcMar>
+              <w:top w:type="dxa" w:w="90"/>
+              <w:left w:type="dxa" w:w="110"/>
+              <w:bottom w:type="dxa" w:w="90"/>
+              <w:right w:type="dxa" w:w="110"/>
+            </w:tcMar>
+          </w:tcPr>
+          <w:p>
+            <w:r>
+              <w:rPr>
+                <w:rFonts w:ascii="Arial" w:cs="Arial" w:eastAsia="Arial" w:hAnsi="Arial"/>
+                <w:b w:val="false"/>
+                <w:bCs w:val="false"/>
+                <w:color w:val="1F2937"/>
+                <w:sz w:val="18"/>
+                <w:szCs w:val="18"/>
+              </w:rPr>
+              <w:t xml:space="preserve">~$400–1,600/yr</w:t>
+            </w:r>
+          </w:p>
+        </w:tc>
+        <w:tc>
+          <w:tcPr>
+            <w:tcW w:type="dxa" w:w="5200"/>
+            <w:shd w:fill="F6F5F3" w:val="clear"/>
+            <w:tcMar>
+              <w:top w:type="dxa" w:w="90"/>
+              <w:left w:type="dxa" w:w="110"/>
+              <w:bottom w:type="dxa" w:w="90"/>
+              <w:right w:type="dxa" w:w="110"/>
+            </w:tcMar>
+          </w:tcPr>
+          <w:p>
+            <w:r>
+              <w:rPr>
+                <w:rFonts w:ascii="Arial" w:cs="Arial" w:eastAsia="Arial" w:hAnsi="Arial"/>
+                <w:b w:val="false"/>
+                <w:bCs w:val="false"/>
+                <w:color w:val="1F2937"/>
+                <w:sz w:val="18"/>
+                <w:szCs w:val="18"/>
+              </w:rPr>
+              <w:t xml:space="preserve">Covers data breach/ransomware response — forensics, legal review, client notification. Client data already lives across Firestore, LucidLink, Frame.io, HubSpot, Klaviyo and the Hub itself, none of which GL, E&amp;O or Equipment coverage touches.</w:t>
+            </w:r>
+          </w:p>
+        </w:tc>
+      </w:tr>
     </w:tbl>
     <w:p>
       <w:pPr>
@@ -2508,6 +4193,837 @@
                 <w:szCs w:val="18"/>
               </w:rPr>
               <w:t xml:space="preserve">Shared, audited access to logins — ClickUp, Stripe, ad accounts, social accounts — instead of passing passwords around directly. Worth having before the team grows past just you.</w:t>
+            </w:r>
+          </w:p>
+        </w:tc>
+      </w:tr>
+      <w:tr>
+        <w:tc>
+          <w:tcPr>
+            <w:tcW w:type="dxa" w:w="2600"/>
+            <w:shd w:fill="F6F5F3" w:val="clear"/>
+            <w:tcMar>
+              <w:top w:type="dxa" w:w="90"/>
+              <w:left w:type="dxa" w:w="110"/>
+              <w:bottom w:type="dxa" w:w="90"/>
+              <w:right w:type="dxa" w:w="110"/>
+            </w:tcMar>
+          </w:tcPr>
+          <w:p>
+            <w:r>
+              <w:rPr>
+                <w:rFonts w:ascii="Arial" w:cs="Arial" w:eastAsia="Arial" w:hAnsi="Arial"/>
+                <w:b/>
+                <w:bCs/>
+                <w:color w:val="1F2937"/>
+                <w:sz w:val="18"/>
+                <w:szCs w:val="18"/>
+              </w:rPr>
+              <w:t xml:space="preserve">Ramp or Brex</w:t>
+            </w:r>
+          </w:p>
+        </w:tc>
+        <w:tc>
+          <w:tcPr>
+            <w:tcW w:type="dxa" w:w="3000"/>
+            <w:shd w:fill="F6F5F3" w:val="clear"/>
+            <w:tcMar>
+              <w:top w:type="dxa" w:w="90"/>
+              <w:left w:type="dxa" w:w="110"/>
+              <w:bottom w:type="dxa" w:w="90"/>
+              <w:right w:type="dxa" w:w="110"/>
+            </w:tcMar>
+          </w:tcPr>
+          <w:p>
+            <w:r>
+              <w:rPr>
+                <w:rFonts w:ascii="Arial" w:cs="Arial" w:eastAsia="Arial" w:hAnsi="Arial"/>
+                <w:b w:val="false"/>
+                <w:bCs w:val="false"/>
+                <w:color w:val="1F2937"/>
+                <w:sz w:val="18"/>
+                <w:szCs w:val="18"/>
+              </w:rPr>
+              <w:t xml:space="preserve">Free (revenue from card interchange, not subscription fees)</w:t>
+            </w:r>
+          </w:p>
+        </w:tc>
+        <w:tc>
+          <w:tcPr>
+            <w:tcW w:type="dxa" w:w="4600"/>
+            <w:shd w:fill="F6F5F3" w:val="clear"/>
+            <w:tcMar>
+              <w:top w:type="dxa" w:w="90"/>
+              <w:left w:type="dxa" w:w="110"/>
+              <w:bottom w:type="dxa" w:w="90"/>
+              <w:right w:type="dxa" w:w="110"/>
+            </w:tcMar>
+          </w:tcPr>
+          <w:p>
+            <w:r>
+              <w:rPr>
+                <w:rFonts w:ascii="Arial" w:cs="Arial" w:eastAsia="Arial" w:hAnsi="Arial"/>
+                <w:b w:val="false"/>
+                <w:bCs w:val="false"/>
+                <w:color w:val="1F2937"/>
+                <w:sz w:val="18"/>
+                <w:szCs w:val="18"/>
+              </w:rPr>
+              <w:t xml:space="preserve">Business expense cards with automatic transaction-level tracking and receipt capture — catches spend the Subscription Tracker wouldn't (one-off equipment/vendor purchases), on top of the recurring-software view that tracker already covers.</w:t>
+            </w:r>
+          </w:p>
+        </w:tc>
+      </w:tr>
+    </w:tbl>
+    <w:p>
+      <w:pPr>
+        <w:pBdr>
+          <w:top w:val="single" w:color="E5E7EB" w:sz="4" w:space="8"/>
+        </w:pBdr>
+        <w:spacing w:after="0" w:before="280"/>
+      </w:pPr>
+      <w:r>
+        <w:rPr>
+          <w:rFonts w:ascii="Arial" w:cs="Arial" w:eastAsia="Arial" w:hAnsi="Arial"/>
+          <w:b/>
+          <w:bCs/>
+          <w:color w:val="F68D5F"/>
+          <w:spacing w:val="20"/>
+          <w:sz w:val="16"/>
+          <w:szCs w:val="16"/>
+        </w:rPr>
+        <w:t xml:space="preserve">REFERENCE</w:t>
+      </w:r>
+    </w:p>
+    <w:p>
+      <w:pPr>
+        <w:spacing w:after="160" w:before="60"/>
+      </w:pPr>
+      <w:r>
+        <w:rPr>
+          <w:rFonts w:ascii="Arial" w:cs="Arial" w:eastAsia="Arial" w:hAnsi="Arial"/>
+          <w:b/>
+          <w:bCs/>
+          <w:color w:val="1F2937"/>
+          <w:sz w:val="27"/>
+          <w:szCs w:val="27"/>
+        </w:rPr>
+        <w:t xml:space="preserve">Alternative Options</w:t>
+      </w:r>
+    </w:p>
+    <w:p>
+      <w:pPr>
+        <w:spacing w:after="180"/>
+      </w:pPr>
+      <w:r>
+        <w:rPr>
+          <w:rFonts w:ascii="Arial" w:cs="Arial" w:eastAsia="Arial" w:hAnsi="Arial"/>
+          <w:i w:val="false"/>
+          <w:iCs w:val="false"/>
+          <w:color w:val="374151"/>
+          <w:sz w:val="20"/>
+          <w:szCs w:val="20"/>
+        </w:rPr>
+        <w:t xml:space="preserve">Where a strong alternative came up in discussion for a tool already on this list, it's noted here rather than duplicating a full line item above.</w:t>
+      </w:r>
+    </w:p>
+    <w:tbl>
+      <w:tblPr>
+        <w:tblW w:type="dxa" w:w="9800"/>
+        <w:tblBorders>
+          <w:top w:val="single" w:color="auto" w:sz="4"/>
+          <w:left w:val="single" w:color="auto" w:sz="4"/>
+          <w:bottom w:val="single" w:color="auto" w:sz="4"/>
+          <w:right w:val="single" w:color="auto" w:sz="4"/>
+          <w:insideH w:val="single" w:color="auto" w:sz="4"/>
+          <w:insideV w:val="single" w:color="auto" w:sz="4"/>
+        </w:tblBorders>
+      </w:tblPr>
+      <w:tblGrid>
+        <w:gridCol w:w="2300"/>
+        <w:gridCol w:w="2600"/>
+        <w:gridCol w:w="4900"/>
+      </w:tblGrid>
+      <w:tr>
+        <w:trPr>
+          <w:tblHeader/>
+        </w:trPr>
+        <w:tc>
+          <w:tcPr>
+            <w:tcW w:type="dxa" w:w="2300"/>
+            <w:shd w:fill="1A1A1A" w:val="clear"/>
+            <w:tcMar>
+              <w:top w:type="dxa" w:w="90"/>
+              <w:left w:type="dxa" w:w="110"/>
+              <w:bottom w:type="dxa" w:w="90"/>
+              <w:right w:type="dxa" w:w="110"/>
+            </w:tcMar>
+          </w:tcPr>
+          <w:p>
+            <w:r>
+              <w:rPr>
+                <w:rFonts w:ascii="Arial" w:cs="Arial" w:eastAsia="Arial" w:hAnsi="Arial"/>
+                <w:b/>
+                <w:bCs/>
+                <w:color w:val="FFFFFF"/>
+                <w:sz w:val="17"/>
+                <w:szCs w:val="17"/>
+              </w:rPr>
+              <w:t xml:space="preserve">Primary Pick</w:t>
+            </w:r>
+          </w:p>
+        </w:tc>
+        <w:tc>
+          <w:tcPr>
+            <w:tcW w:type="dxa" w:w="2600"/>
+            <w:shd w:fill="1A1A1A" w:val="clear"/>
+            <w:tcMar>
+              <w:top w:type="dxa" w:w="90"/>
+              <w:left w:type="dxa" w:w="110"/>
+              <w:bottom w:type="dxa" w:w="90"/>
+              <w:right w:type="dxa" w:w="110"/>
+            </w:tcMar>
+          </w:tcPr>
+          <w:p>
+            <w:r>
+              <w:rPr>
+                <w:rFonts w:ascii="Arial" w:cs="Arial" w:eastAsia="Arial" w:hAnsi="Arial"/>
+                <w:b/>
+                <w:bCs/>
+                <w:color w:val="FFFFFF"/>
+                <w:sz w:val="17"/>
+                <w:szCs w:val="17"/>
+              </w:rPr>
+              <w:t xml:space="preserve">Alternative(s)</w:t>
+            </w:r>
+          </w:p>
+        </w:tc>
+        <w:tc>
+          <w:tcPr>
+            <w:tcW w:type="dxa" w:w="4900"/>
+            <w:shd w:fill="1A1A1A" w:val="clear"/>
+            <w:tcMar>
+              <w:top w:type="dxa" w:w="90"/>
+              <w:left w:type="dxa" w:w="110"/>
+              <w:bottom w:type="dxa" w:w="90"/>
+              <w:right w:type="dxa" w:w="110"/>
+            </w:tcMar>
+          </w:tcPr>
+          <w:p>
+            <w:r>
+              <w:rPr>
+                <w:rFonts w:ascii="Arial" w:cs="Arial" w:eastAsia="Arial" w:hAnsi="Arial"/>
+                <w:b/>
+                <w:bCs/>
+                <w:color w:val="FFFFFF"/>
+                <w:sz w:val="17"/>
+                <w:szCs w:val="17"/>
+              </w:rPr>
+              <w:t xml:space="preserve">When to Consider It Instead</w:t>
+            </w:r>
+          </w:p>
+        </w:tc>
+      </w:tr>
+      <w:tr>
+        <w:tc>
+          <w:tcPr>
+            <w:tcW w:type="dxa" w:w="2300"/>
+            <w:tcMar>
+              <w:top w:type="dxa" w:w="90"/>
+              <w:left w:type="dxa" w:w="110"/>
+              <w:bottom w:type="dxa" w:w="90"/>
+              <w:right w:type="dxa" w:w="110"/>
+            </w:tcMar>
+          </w:tcPr>
+          <w:p>
+            <w:r>
+              <w:rPr>
+                <w:rFonts w:ascii="Arial" w:cs="Arial" w:eastAsia="Arial" w:hAnsi="Arial"/>
+                <w:b/>
+                <w:bCs/>
+                <w:color w:val="1F2937"/>
+                <w:sz w:val="18"/>
+                <w:szCs w:val="18"/>
+              </w:rPr>
+              <w:t xml:space="preserve">OpenPhone (or Quo)</w:t>
+            </w:r>
+          </w:p>
+        </w:tc>
+        <w:tc>
+          <w:tcPr>
+            <w:tcW w:type="dxa" w:w="2600"/>
+            <w:tcMar>
+              <w:top w:type="dxa" w:w="90"/>
+              <w:left w:type="dxa" w:w="110"/>
+              <w:bottom w:type="dxa" w:w="90"/>
+              <w:right w:type="dxa" w:w="110"/>
+            </w:tcMar>
+          </w:tcPr>
+          <w:p>
+            <w:r>
+              <w:rPr>
+                <w:rFonts w:ascii="Arial" w:cs="Arial" w:eastAsia="Arial" w:hAnsi="Arial"/>
+                <w:b w:val="false"/>
+                <w:bCs w:val="false"/>
+                <w:color w:val="1F2937"/>
+                <w:sz w:val="18"/>
+                <w:szCs w:val="18"/>
+              </w:rPr>
+              <w:t xml:space="preserve">Grasshopper; Dialpad; RingCentral</w:t>
+            </w:r>
+          </w:p>
+        </w:tc>
+        <w:tc>
+          <w:tcPr>
+            <w:tcW w:type="dxa" w:w="4900"/>
+            <w:tcMar>
+              <w:top w:type="dxa" w:w="90"/>
+              <w:left w:type="dxa" w:w="110"/>
+              <w:bottom w:type="dxa" w:w="90"/>
+              <w:right w:type="dxa" w:w="110"/>
+            </w:tcMar>
+          </w:tcPr>
+          <w:p>
+            <w:r>
+              <w:rPr>
+                <w:rFonts w:ascii="Arial" w:cs="Arial" w:eastAsia="Arial" w:hAnsi="Arial"/>
+                <w:b w:val="false"/>
+                <w:bCs w:val="false"/>
+                <w:color w:val="1F2937"/>
+                <w:sz w:val="18"/>
+                <w:szCs w:val="18"/>
+              </w:rPr>
+              <w:t xml:space="preserve">Grasshopper is simpler/cheaper with no frills. Dialpad leans harder into AI call transcription. RingCentral is built for scaling well past a small team — likely overkill right now.</w:t>
+            </w:r>
+          </w:p>
+        </w:tc>
+      </w:tr>
+      <w:tr>
+        <w:tc>
+          <w:tcPr>
+            <w:tcW w:type="dxa" w:w="2300"/>
+            <w:shd w:fill="F6F5F3" w:val="clear"/>
+            <w:tcMar>
+              <w:top w:type="dxa" w:w="90"/>
+              <w:left w:type="dxa" w:w="110"/>
+              <w:bottom w:type="dxa" w:w="90"/>
+              <w:right w:type="dxa" w:w="110"/>
+            </w:tcMar>
+          </w:tcPr>
+          <w:p>
+            <w:r>
+              <w:rPr>
+                <w:rFonts w:ascii="Arial" w:cs="Arial" w:eastAsia="Arial" w:hAnsi="Arial"/>
+                <w:b/>
+                <w:bCs/>
+                <w:color w:val="1F2937"/>
+                <w:sz w:val="18"/>
+                <w:szCs w:val="18"/>
+              </w:rPr>
+              <w:t xml:space="preserve">Bitwarden Teams</w:t>
+            </w:r>
+          </w:p>
+        </w:tc>
+        <w:tc>
+          <w:tcPr>
+            <w:tcW w:type="dxa" w:w="2600"/>
+            <w:shd w:fill="F6F5F3" w:val="clear"/>
+            <w:tcMar>
+              <w:top w:type="dxa" w:w="90"/>
+              <w:left w:type="dxa" w:w="110"/>
+              <w:bottom w:type="dxa" w:w="90"/>
+              <w:right w:type="dxa" w:w="110"/>
+            </w:tcMar>
+          </w:tcPr>
+          <w:p>
+            <w:r>
+              <w:rPr>
+                <w:rFonts w:ascii="Arial" w:cs="Arial" w:eastAsia="Arial" w:hAnsi="Arial"/>
+                <w:b w:val="false"/>
+                <w:bCs w:val="false"/>
+                <w:color w:val="1F2937"/>
+                <w:sz w:val="18"/>
+                <w:szCs w:val="18"/>
+              </w:rPr>
+              <w:t xml:space="preserve">1Password Teams</w:t>
+            </w:r>
+          </w:p>
+        </w:tc>
+        <w:tc>
+          <w:tcPr>
+            <w:tcW w:type="dxa" w:w="4900"/>
+            <w:shd w:fill="F6F5F3" w:val="clear"/>
+            <w:tcMar>
+              <w:top w:type="dxa" w:w="90"/>
+              <w:left w:type="dxa" w:w="110"/>
+              <w:bottom w:type="dxa" w:w="90"/>
+              <w:right w:type="dxa" w:w="110"/>
+            </w:tcMar>
+          </w:tcPr>
+          <w:p>
+            <w:r>
+              <w:rPr>
+                <w:rFonts w:ascii="Arial" w:cs="Arial" w:eastAsia="Arial" w:hAnsi="Arial"/>
+                <w:b w:val="false"/>
+                <w:bCs w:val="false"/>
+                <w:color w:val="1F2937"/>
+                <w:sz w:val="18"/>
+                <w:szCs w:val="18"/>
+              </w:rPr>
+              <w:t xml:space="preserve">Nearly identical feature set — 1Password costs more per seat but has a slightly more polished interface.</w:t>
+            </w:r>
+          </w:p>
+        </w:tc>
+      </w:tr>
+      <w:tr>
+        <w:tc>
+          <w:tcPr>
+            <w:tcW w:type="dxa" w:w="2300"/>
+            <w:tcMar>
+              <w:top w:type="dxa" w:w="90"/>
+              <w:left w:type="dxa" w:w="110"/>
+              <w:bottom w:type="dxa" w:w="90"/>
+              <w:right w:type="dxa" w:w="110"/>
+            </w:tcMar>
+          </w:tcPr>
+          <w:p>
+            <w:r>
+              <w:rPr>
+                <w:rFonts w:ascii="Arial" w:cs="Arial" w:eastAsia="Arial" w:hAnsi="Arial"/>
+                <w:b/>
+                <w:bCs/>
+                <w:color w:val="1F2937"/>
+                <w:sz w:val="18"/>
+                <w:szCs w:val="18"/>
+              </w:rPr>
+              <w:t xml:space="preserve">Logic Pro</w:t>
+            </w:r>
+          </w:p>
+        </w:tc>
+        <w:tc>
+          <w:tcPr>
+            <w:tcW w:type="dxa" w:w="2600"/>
+            <w:tcMar>
+              <w:top w:type="dxa" w:w="90"/>
+              <w:left w:type="dxa" w:w="110"/>
+              <w:bottom w:type="dxa" w:w="90"/>
+              <w:right w:type="dxa" w:w="110"/>
+            </w:tcMar>
+          </w:tcPr>
+          <w:p>
+            <w:r>
+              <w:rPr>
+                <w:rFonts w:ascii="Arial" w:cs="Arial" w:eastAsia="Arial" w:hAnsi="Arial"/>
+                <w:b w:val="false"/>
+                <w:bCs w:val="false"/>
+                <w:color w:val="1F2937"/>
+                <w:sz w:val="18"/>
+                <w:szCs w:val="18"/>
+              </w:rPr>
+              <w:t xml:space="preserve">Pro Tools</w:t>
+            </w:r>
+          </w:p>
+        </w:tc>
+        <w:tc>
+          <w:tcPr>
+            <w:tcW w:type="dxa" w:w="4900"/>
+            <w:tcMar>
+              <w:top w:type="dxa" w:w="90"/>
+              <w:left w:type="dxa" w:w="110"/>
+              <w:bottom w:type="dxa" w:w="90"/>
+              <w:right w:type="dxa" w:w="110"/>
+            </w:tcMar>
+          </w:tcPr>
+          <w:p>
+            <w:r>
+              <w:rPr>
+                <w:rFonts w:ascii="Arial" w:cs="Arial" w:eastAsia="Arial" w:hAnsi="Arial"/>
+                <w:b w:val="false"/>
+                <w:bCs w:val="false"/>
+                <w:color w:val="1F2937"/>
+                <w:sz w:val="18"/>
+                <w:szCs w:val="18"/>
+              </w:rPr>
+              <w:t xml:space="preserve">Pro Tools is the true industry standard and works cross-platform (Windows + Mac), but it's subscription-based and pricier than Logic's one-time fee.</w:t>
+            </w:r>
+          </w:p>
+        </w:tc>
+      </w:tr>
+      <w:tr>
+        <w:tc>
+          <w:tcPr>
+            <w:tcW w:type="dxa" w:w="2300"/>
+            <w:shd w:fill="F6F5F3" w:val="clear"/>
+            <w:tcMar>
+              <w:top w:type="dxa" w:w="90"/>
+              <w:left w:type="dxa" w:w="110"/>
+              <w:bottom w:type="dxa" w:w="90"/>
+              <w:right w:type="dxa" w:w="110"/>
+            </w:tcMar>
+          </w:tcPr>
+          <w:p>
+            <w:r>
+              <w:rPr>
+                <w:rFonts w:ascii="Arial" w:cs="Arial" w:eastAsia="Arial" w:hAnsi="Arial"/>
+                <w:b/>
+                <w:bCs/>
+                <w:color w:val="1F2937"/>
+                <w:sz w:val="18"/>
+                <w:szCs w:val="18"/>
+              </w:rPr>
+              <w:t xml:space="preserve">Epidemic Sound</w:t>
+            </w:r>
+          </w:p>
+        </w:tc>
+        <w:tc>
+          <w:tcPr>
+            <w:tcW w:type="dxa" w:w="2600"/>
+            <w:shd w:fill="F6F5F3" w:val="clear"/>
+            <w:tcMar>
+              <w:top w:type="dxa" w:w="90"/>
+              <w:left w:type="dxa" w:w="110"/>
+              <w:bottom w:type="dxa" w:w="90"/>
+              <w:right w:type="dxa" w:w="110"/>
+            </w:tcMar>
+          </w:tcPr>
+          <w:p>
+            <w:r>
+              <w:rPr>
+                <w:rFonts w:ascii="Arial" w:cs="Arial" w:eastAsia="Arial" w:hAnsi="Arial"/>
+                <w:b w:val="false"/>
+                <w:bCs w:val="false"/>
+                <w:color w:val="1F2937"/>
+                <w:sz w:val="18"/>
+                <w:szCs w:val="18"/>
+              </w:rPr>
+              <w:t xml:space="preserve">Artlist</w:t>
+            </w:r>
+          </w:p>
+        </w:tc>
+        <w:tc>
+          <w:tcPr>
+            <w:tcW w:type="dxa" w:w="4900"/>
+            <w:shd w:fill="F6F5F3" w:val="clear"/>
+            <w:tcMar>
+              <w:top w:type="dxa" w:w="90"/>
+              <w:left w:type="dxa" w:w="110"/>
+              <w:bottom w:type="dxa" w:w="90"/>
+              <w:right w:type="dxa" w:w="110"/>
+            </w:tcMar>
+          </w:tcPr>
+          <w:p>
+            <w:r>
+              <w:rPr>
+                <w:rFonts w:ascii="Arial" w:cs="Arial" w:eastAsia="Arial" w:hAnsi="Arial"/>
+                <w:b w:val="false"/>
+                <w:bCs w:val="false"/>
+                <w:color w:val="1F2937"/>
+                <w:sz w:val="18"/>
+                <w:szCs w:val="18"/>
+              </w:rPr>
+              <w:t xml:space="preserve">Artlist has a smaller music catalog but bundles in stock footage, video templates and LUTs — worth a look if footage/templates matter as much as music.</w:t>
+            </w:r>
+          </w:p>
+        </w:tc>
+      </w:tr>
+      <w:tr>
+        <w:tc>
+          <w:tcPr>
+            <w:tcW w:type="dxa" w:w="2300"/>
+            <w:tcMar>
+              <w:top w:type="dxa" w:w="90"/>
+              <w:left w:type="dxa" w:w="110"/>
+              <w:bottom w:type="dxa" w:w="90"/>
+              <w:right w:type="dxa" w:w="110"/>
+            </w:tcMar>
+          </w:tcPr>
+          <w:p>
+            <w:r>
+              <w:rPr>
+                <w:rFonts w:ascii="Arial" w:cs="Arial" w:eastAsia="Arial" w:hAnsi="Arial"/>
+                <w:b/>
+                <w:bCs/>
+                <w:color w:val="1F2937"/>
+                <w:sz w:val="18"/>
+                <w:szCs w:val="18"/>
+              </w:rPr>
+              <w:t xml:space="preserve">vMix</w:t>
+            </w:r>
+          </w:p>
+        </w:tc>
+        <w:tc>
+          <w:tcPr>
+            <w:tcW w:type="dxa" w:w="2600"/>
+            <w:tcMar>
+              <w:top w:type="dxa" w:w="90"/>
+              <w:left w:type="dxa" w:w="110"/>
+              <w:bottom w:type="dxa" w:w="90"/>
+              <w:right w:type="dxa" w:w="110"/>
+            </w:tcMar>
+          </w:tcPr>
+          <w:p>
+            <w:r>
+              <w:rPr>
+                <w:rFonts w:ascii="Arial" w:cs="Arial" w:eastAsia="Arial" w:hAnsi="Arial"/>
+                <w:b w:val="false"/>
+                <w:bCs w:val="false"/>
+                <w:color w:val="1F2937"/>
+                <w:sz w:val="18"/>
+                <w:szCs w:val="18"/>
+              </w:rPr>
+              <w:t xml:space="preserve">OBS Studio (free); Blackmagic ATEM (hardware)</w:t>
+            </w:r>
+          </w:p>
+        </w:tc>
+        <w:tc>
+          <w:tcPr>
+            <w:tcW w:type="dxa" w:w="4900"/>
+            <w:tcMar>
+              <w:top w:type="dxa" w:w="90"/>
+              <w:left w:type="dxa" w:w="110"/>
+              <w:bottom w:type="dxa" w:w="90"/>
+              <w:right w:type="dxa" w:w="110"/>
+            </w:tcMar>
+          </w:tcPr>
+          <w:p>
+            <w:r>
+              <w:rPr>
+                <w:rFonts w:ascii="Arial" w:cs="Arial" w:eastAsia="Arial" w:hAnsi="Arial"/>
+                <w:b w:val="false"/>
+                <w:bCs w:val="false"/>
+                <w:color w:val="1F2937"/>
+                <w:sz w:val="18"/>
+                <w:szCs w:val="18"/>
+              </w:rPr>
+              <w:t xml:space="preserve">OBS is the free software-only fallback; Blackmagic ATEM is the physical-switcher step up once volume justifies it — both already have their own line items above.</w:t>
+            </w:r>
+          </w:p>
+        </w:tc>
+      </w:tr>
+      <w:tr>
+        <w:tc>
+          <w:tcPr>
+            <w:tcW w:type="dxa" w:w="2300"/>
+            <w:shd w:fill="F6F5F3" w:val="clear"/>
+            <w:tcMar>
+              <w:top w:type="dxa" w:w="90"/>
+              <w:left w:type="dxa" w:w="110"/>
+              <w:bottom w:type="dxa" w:w="90"/>
+              <w:right w:type="dxa" w:w="110"/>
+            </w:tcMar>
+          </w:tcPr>
+          <w:p>
+            <w:r>
+              <w:rPr>
+                <w:rFonts w:ascii="Arial" w:cs="Arial" w:eastAsia="Arial" w:hAnsi="Arial"/>
+                <w:b/>
+                <w:bCs/>
+                <w:color w:val="1F2937"/>
+                <w:sz w:val="18"/>
+                <w:szCs w:val="18"/>
+              </w:rPr>
+              <w:t xml:space="preserve">Shopify Plus</w:t>
+            </w:r>
+          </w:p>
+        </w:tc>
+        <w:tc>
+          <w:tcPr>
+            <w:tcW w:type="dxa" w:w="2600"/>
+            <w:shd w:fill="F6F5F3" w:val="clear"/>
+            <w:tcMar>
+              <w:top w:type="dxa" w:w="90"/>
+              <w:left w:type="dxa" w:w="110"/>
+              <w:bottom w:type="dxa" w:w="90"/>
+              <w:right w:type="dxa" w:w="110"/>
+            </w:tcMar>
+          </w:tcPr>
+          <w:p>
+            <w:r>
+              <w:rPr>
+                <w:rFonts w:ascii="Arial" w:cs="Arial" w:eastAsia="Arial" w:hAnsi="Arial"/>
+                <w:b w:val="false"/>
+                <w:bCs w:val="false"/>
+                <w:color w:val="1F2937"/>
+                <w:sz w:val="18"/>
+                <w:szCs w:val="18"/>
+              </w:rPr>
+              <w:t xml:space="preserve">BigCommerce Enterprise</w:t>
+            </w:r>
+          </w:p>
+        </w:tc>
+        <w:tc>
+          <w:tcPr>
+            <w:tcW w:type="dxa" w:w="4900"/>
+            <w:shd w:fill="F6F5F3" w:val="clear"/>
+            <w:tcMar>
+              <w:top w:type="dxa" w:w="90"/>
+              <w:left w:type="dxa" w:w="110"/>
+              <w:bottom w:type="dxa" w:w="90"/>
+              <w:right w:type="dxa" w:w="110"/>
+            </w:tcMar>
+          </w:tcPr>
+          <w:p>
+            <w:r>
+              <w:rPr>
+                <w:rFonts w:ascii="Arial" w:cs="Arial" w:eastAsia="Arial" w:hAnsi="Arial"/>
+                <w:b w:val="false"/>
+                <w:bCs w:val="false"/>
+                <w:color w:val="1F2937"/>
+                <w:sz w:val="18"/>
+                <w:szCs w:val="18"/>
+              </w:rPr>
+              <w:t xml:space="preserve">Shopify Plus is faster to launch with the bigger app ecosystem; BigCommerce is stronger for large/complex catalogs and B2B pricing rules with fewer paid add-ons needed.</w:t>
+            </w:r>
+          </w:p>
+        </w:tc>
+      </w:tr>
+      <w:tr>
+        <w:tc>
+          <w:tcPr>
+            <w:tcW w:type="dxa" w:w="2300"/>
+            <w:tcMar>
+              <w:top w:type="dxa" w:w="90"/>
+              <w:left w:type="dxa" w:w="110"/>
+              <w:bottom w:type="dxa" w:w="90"/>
+              <w:right w:type="dxa" w:w="110"/>
+            </w:tcMar>
+          </w:tcPr>
+          <w:p>
+            <w:r>
+              <w:rPr>
+                <w:rFonts w:ascii="Arial" w:cs="Arial" w:eastAsia="Arial" w:hAnsi="Arial"/>
+                <w:b/>
+                <w:bCs/>
+                <w:color w:val="1F2937"/>
+                <w:sz w:val="18"/>
+                <w:szCs w:val="18"/>
+              </w:rPr>
+              <w:t xml:space="preserve">Ahrefs or SEMrush</w:t>
+            </w:r>
+          </w:p>
+        </w:tc>
+        <w:tc>
+          <w:tcPr>
+            <w:tcW w:type="dxa" w:w="2600"/>
+            <w:tcMar>
+              <w:top w:type="dxa" w:w="90"/>
+              <w:left w:type="dxa" w:w="110"/>
+              <w:bottom w:type="dxa" w:w="90"/>
+              <w:right w:type="dxa" w:w="110"/>
+            </w:tcMar>
+          </w:tcPr>
+          <w:p>
+            <w:r>
+              <w:rPr>
+                <w:rFonts w:ascii="Arial" w:cs="Arial" w:eastAsia="Arial" w:hAnsi="Arial"/>
+                <w:b w:val="false"/>
+                <w:bCs w:val="false"/>
+                <w:color w:val="1F2937"/>
+                <w:sz w:val="18"/>
+                <w:szCs w:val="18"/>
+              </w:rPr>
+              <w:t xml:space="preserve">Moz Pro</w:t>
+            </w:r>
+          </w:p>
+        </w:tc>
+        <w:tc>
+          <w:tcPr>
+            <w:tcW w:type="dxa" w:w="4900"/>
+            <w:tcMar>
+              <w:top w:type="dxa" w:w="90"/>
+              <w:left w:type="dxa" w:w="110"/>
+              <w:bottom w:type="dxa" w:w="90"/>
+              <w:right w:type="dxa" w:w="110"/>
+            </w:tcMar>
+          </w:tcPr>
+          <w:p>
+            <w:r>
+              <w:rPr>
+                <w:rFonts w:ascii="Arial" w:cs="Arial" w:eastAsia="Arial" w:hAnsi="Arial"/>
+                <w:b w:val="false"/>
+                <w:bCs w:val="false"/>
+                <w:color w:val="1F2937"/>
+                <w:sz w:val="18"/>
+                <w:szCs w:val="18"/>
+              </w:rPr>
+              <w:t xml:space="preserve">A third SEO option if neither Ahrefs nor SEMrush fits — generally considered a notch behind both on data depth, but cheaper.</w:t>
+            </w:r>
+          </w:p>
+        </w:tc>
+      </w:tr>
+      <w:tr>
+        <w:tc>
+          <w:tcPr>
+            <w:tcW w:type="dxa" w:w="2300"/>
+            <w:shd w:fill="F6F5F3" w:val="clear"/>
+            <w:tcMar>
+              <w:top w:type="dxa" w:w="90"/>
+              <w:left w:type="dxa" w:w="110"/>
+              <w:bottom w:type="dxa" w:w="90"/>
+              <w:right w:type="dxa" w:w="110"/>
+            </w:tcMar>
+          </w:tcPr>
+          <w:p>
+            <w:r>
+              <w:rPr>
+                <w:rFonts w:ascii="Arial" w:cs="Arial" w:eastAsia="Arial" w:hAnsi="Arial"/>
+                <w:b/>
+                <w:bCs/>
+                <w:color w:val="1F2937"/>
+                <w:sz w:val="18"/>
+                <w:szCs w:val="18"/>
+              </w:rPr>
+              <w:t xml:space="preserve">Dropbox Sign</w:t>
+            </w:r>
+          </w:p>
+        </w:tc>
+        <w:tc>
+          <w:tcPr>
+            <w:tcW w:type="dxa" w:w="2600"/>
+            <w:shd w:fill="F6F5F3" w:val="clear"/>
+            <w:tcMar>
+              <w:top w:type="dxa" w:w="90"/>
+              <w:left w:type="dxa" w:w="110"/>
+              <w:bottom w:type="dxa" w:w="90"/>
+              <w:right w:type="dxa" w:w="110"/>
+            </w:tcMar>
+          </w:tcPr>
+          <w:p>
+            <w:r>
+              <w:rPr>
+                <w:rFonts w:ascii="Arial" w:cs="Arial" w:eastAsia="Arial" w:hAnsi="Arial"/>
+                <w:b w:val="false"/>
+                <w:bCs w:val="false"/>
+                <w:color w:val="1F2937"/>
+                <w:sz w:val="18"/>
+                <w:szCs w:val="18"/>
+              </w:rPr>
+              <w:t xml:space="preserve">DocuSign; PandaDoc</w:t>
+            </w:r>
+          </w:p>
+        </w:tc>
+        <w:tc>
+          <w:tcPr>
+            <w:tcW w:type="dxa" w:w="4900"/>
+            <w:shd w:fill="F6F5F3" w:val="clear"/>
+            <w:tcMar>
+              <w:top w:type="dxa" w:w="90"/>
+              <w:left w:type="dxa" w:w="110"/>
+              <w:bottom w:type="dxa" w:w="90"/>
+              <w:right w:type="dxa" w:w="110"/>
+            </w:tcMar>
+          </w:tcPr>
+          <w:p>
+            <w:r>
+              <w:rPr>
+                <w:rFonts w:ascii="Arial" w:cs="Arial" w:eastAsia="Arial" w:hAnsi="Arial"/>
+                <w:b w:val="false"/>
+                <w:bCs w:val="false"/>
+                <w:color w:val="1F2937"/>
+                <w:sz w:val="18"/>
+                <w:szCs w:val="18"/>
+              </w:rPr>
+              <w:t xml:space="preserve">DocuSign is the more recognizable brand name to clients; PandaDoc adds proposal/quote building on top of e-signatures.</w:t>
             </w:r>
           </w:p>
         </w:tc>

</xml_diff>